<commit_message>
Article: add author biographies
- Çağlar Akman bio (BSc/MSc METU 2008/2017, PhD candidate, HAVELSAN Modeling and Sensor Technologies Team Leader)
- Kemal Leblebicioğlu bio verbatim from T-AES 2013 paper, with photo (floating, IEEE style)
- Çağlar photo slot pending upload
</commit_message>
<xml_diff>
--- a/02_Article/DisasterAware_Article.docx
+++ b/02_Article/DisasterAware_Article.docx
@@ -818,6 +818,85 @@
     </w:p>
     <w:p>
       <w:pPr/>
+    </w:p>
+    <w:p>
+      <w:pPr/>
+    </w:p>
+    <w:p>
+      <w:pPr/>
+      <w:r>
+        <w:rPr>
+          <w:b/>
+        </w:rPr>
+        <w:t xml:space="preserve">Çağlar Akman </w:t>
+      </w:r>
+      <w:r>
+        <w:t>received the B.S. and M.S. degrees in electrical and electronics engineering from the Middle East Technical University (METU), Ankara, Türkiye, in 2008 and 2017, respectively, where he is currently pursuing the Ph.D. degree. He is currently the Modeling and Sensor Technologies Team Leader at HAVELSAN, Ankara, Türkiye, where he manages national and international research and development projects. His research interests include artificial intelligence, decision support systems, sensor systems, and robotic systems.</w:t>
+      </w:r>
+    </w:p>
+    <w:p>
+      <w:pPr/>
+      <w:r>
+        <w:drawing>
+          <wp:anchor distT="0" distB="0" distL="114300" distR="114300" simplePos="0" relativeHeight="251658240" behindDoc="0" locked="0" layoutInCell="1" allowOverlap="1">
+            <wp:simplePos x="0" y="0"/>
+            <wp:positionH relativeFrom="column">
+              <wp:align>left</wp:align>
+            </wp:positionH>
+            <wp:positionV relativeFrom="paragraph">
+              <wp:posOffset>0</wp:posOffset>
+            </wp:positionV>
+            <wp:extent cx="731520" cy="924025"/>
+            <wp:wrapSquare wrapText="bothSides"/>
+            <wp:docPr id="1" name="Picture 1"/>
+            <wp:cNvGraphicFramePr/>
+            <a:graphic xmlns:a="http://schemas.openxmlformats.org/drawingml/2006/main" xmlns:pic="http://schemas.openxmlformats.org/drawingml/2006/picture">
+              <a:graphicData uri="http://schemas.openxmlformats.org/drawingml/2006/picture">
+                <pic:pic>
+                  <pic:nvPicPr>
+                    <pic:cNvPr id="0" name="img-002.png"/>
+                    <pic:cNvPicPr/>
+                  </pic:nvPicPr>
+                  <pic:blipFill>
+                    <a:blip r:embed="rId33"/>
+                    <a:stretch>
+                      <a:fillRect/>
+                    </a:stretch>
+                  </pic:blipFill>
+                  <pic:spPr>
+                    <a:xfrm>
+                      <a:off x="0" y="0"/>
+                      <a:ext cx="731520" cy="924025"/>
+                    </a:xfrm>
+                    <a:prstGeom prst="rect"/>
+                  </pic:spPr>
+                </pic:pic>
+              </a:graphicData>
+            </a:graphic>
+          </wp:anchor>
+        </w:drawing>
+      </w:r>
+      <w:r>
+        <w:rPr>
+          <w:b/>
+        </w:rPr>
+        <w:t xml:space="preserve">Kemal Leblebicioğlu </w:t>
+      </w:r>
+      <w:r>
+        <w:t>received his Ph.D. from the Department of Mathematics of the Middle East Technical University (METU), in 1988.</w:t>
+      </w:r>
+    </w:p>
+    <w:p>
+      <w:pPr/>
+      <w:r>
+        <w:t>He has been a full professor in the Department of Electrical and Electronics Engineering of METU since 1999. He has a background in optimization, optimal control theory, computer vision, intelligent systems, flight control, walking robots, and unmanned vehicles.</w:t>
+      </w:r>
+    </w:p>
+    <w:p>
+      <w:pPr/>
+      <w:r>
+        <w:t>Dr. Leblebicioğlu has been a member of numerous international program committees and has been (co-) author of more than 40 journal papers, book chapters, and numerous conference papers. He is on several IFAC technical committees. He was the editor of the journal ELEKTRIK published by TÜBİTAK (Turkish Scientific and Technical Research Council) from 1996 to 2009. He is on the editorial board of several Turkish technical journals. He organized an international workshop on computer vision and intelligent systems and two national conferences on control. He conducted several R&amp;D projects as project leader and researcher and gave consultancy to BİLTEN (TÜBİTAK’s Research Center on Electronics and Information Technologies), 3rd Supply and Maintenance Center of Turkish Air Forces (Ankara), TÜBİTAK-İltaren, and to ASELSAN on the topic of “real time automatic visual tracking of targets.” Now he is studying unmanned vehicles, in particular, unmanned air and underwater vehicles. He completed a project (supported by TÜBİTAK) on the construction of a special unmanned under-sea vehicle, called ULISAR, which is a mixture of an ROV and a fully automated system. His current project, also supported by TÜBİTAK, is on the coordinated guidance of multiple unmanned air vehicles. Presently, he is also working as an advisor for the Bahçeşehir University Foundation, BUEV, about matters related to education, developing educational systems to help students and teachers, intelligent testing, and student evaluation systems.</w:t>
+      </w:r>
     </w:p>
     <w:sectPr>
       <w:footnotePr>

</xml_diff>

<commit_message>
Article: add Çağlar Akman bio photo; keep both author photos wrapping correctly
- Embed uploaded portrait for Çağlar Akman (floating, IEEE wrap)
- Column breaks before each biography so photos anchor at column tops
</commit_message>
<xml_diff>
--- a/02_Article/DisasterAware_Article.docx
+++ b/02_Article/DisasterAware_Article.docx
@@ -825,6 +825,49 @@
     <w:p>
       <w:pPr/>
       <w:r>
+        <w:br w:type="column"/>
+      </w:r>
+      <w:r>
+        <w:drawing>
+          <wp:anchor distT="0" distB="0" distL="114300" distR="114300" simplePos="0" relativeHeight="251658240" behindDoc="0" locked="0" layoutInCell="1" allowOverlap="1">
+            <wp:simplePos x="0" y="0"/>
+            <wp:positionH relativeFrom="column">
+              <wp:align>left</wp:align>
+            </wp:positionH>
+            <wp:positionV relativeFrom="paragraph">
+              <wp:posOffset>0</wp:posOffset>
+            </wp:positionV>
+            <wp:extent cx="731520" cy="915840"/>
+            <wp:wrapSquare wrapText="bothSides"/>
+            <wp:docPr id="1" name="Picture 1"/>
+            <wp:cNvGraphicFramePr/>
+            <a:graphic xmlns:a="http://schemas.openxmlformats.org/drawingml/2006/main" xmlns:pic="http://schemas.openxmlformats.org/drawingml/2006/picture">
+              <a:graphicData uri="http://schemas.openxmlformats.org/drawingml/2006/picture">
+                <pic:pic>
+                  <pic:nvPicPr>
+                    <pic:cNvPr id="0" name="caglar_bio.png"/>
+                    <pic:cNvPicPr/>
+                  </pic:nvPicPr>
+                  <pic:blipFill>
+                    <a:blip r:embed="rId33"/>
+                    <a:stretch>
+                      <a:fillRect/>
+                    </a:stretch>
+                  </pic:blipFill>
+                  <pic:spPr>
+                    <a:xfrm>
+                      <a:off x="0" y="0"/>
+                      <a:ext cx="731520" cy="915840"/>
+                    </a:xfrm>
+                    <a:prstGeom prst="rect"/>
+                  </pic:spPr>
+                </pic:pic>
+              </a:graphicData>
+            </a:graphic>
+          </wp:anchor>
+        </w:drawing>
+      </w:r>
+      <w:r>
         <w:rPr>
           <w:b/>
         </w:rPr>
@@ -836,6 +879,9 @@
     </w:p>
     <w:p>
       <w:pPr/>
+      <w:r>
+        <w:br w:type="column"/>
+      </w:r>
       <w:r>
         <w:drawing>
           <wp:anchor distT="0" distB="0" distL="114300" distR="114300" simplePos="0" relativeHeight="251658240" behindDoc="0" locked="0" layoutInCell="1" allowOverlap="1">
@@ -848,7 +894,7 @@
             </wp:positionV>
             <wp:extent cx="731520" cy="924025"/>
             <wp:wrapSquare wrapText="bothSides"/>
-            <wp:docPr id="1" name="Picture 1"/>
+            <wp:docPr id="2" name="Picture 2"/>
             <wp:cNvGraphicFramePr/>
             <a:graphic xmlns:a="http://schemas.openxmlformats.org/drawingml/2006/main" xmlns:pic="http://schemas.openxmlformats.org/drawingml/2006/picture">
               <a:graphicData uri="http://schemas.openxmlformats.org/drawingml/2006/picture">
@@ -858,7 +904,7 @@
                     <pic:cNvPicPr/>
                   </pic:nvPicPr>
                   <pic:blipFill>
-                    <a:blip r:embed="rId33"/>
+                    <a:blip r:embed="rId34"/>
                     <a:stretch>
                       <a:fillRect/>
                     </a:stretch>

</xml_diff>

<commit_message>
Article: update Kemal Leblebicioğlu bio photo (color portrait); add source photos under 02_Article/files
</commit_message>
<xml_diff>
--- a/02_Article/DisasterAware_Article.docx
+++ b/02_Article/DisasterAware_Article.docx
@@ -892,7 +892,7 @@
             <wp:positionV relativeFrom="paragraph">
               <wp:posOffset>0</wp:posOffset>
             </wp:positionV>
-            <wp:extent cx="731520" cy="924025"/>
+            <wp:extent cx="731520" cy="894080"/>
             <wp:wrapSquare wrapText="bothSides"/>
             <wp:docPr id="2" name="Picture 2"/>
             <wp:cNvGraphicFramePr/>
@@ -900,7 +900,7 @@
               <a:graphicData uri="http://schemas.openxmlformats.org/drawingml/2006/picture">
                 <pic:pic>
                   <pic:nvPicPr>
-                    <pic:cNvPr id="0" name="img-002.png"/>
+                    <pic:cNvPr id="0" name="kleb.jpg"/>
                     <pic:cNvPicPr/>
                   </pic:nvPicPr>
                   <pic:blipFill>
@@ -912,7 +912,7 @@
                   <pic:spPr>
                     <a:xfrm>
                       <a:off x="0" y="0"/>
-                      <a:ext cx="731520" cy="924025"/>
+                      <a:ext cx="731520" cy="894080"/>
                     </a:xfrm>
                     <a:prstGeom prst="rect"/>
                   </pic:spPr>

</xml_diff>

<commit_message>
Article: standardize author name to 'Kemal Leblebicioğlu' (byline + footnote)
</commit_message>
<xml_diff>
--- a/02_Article/DisasterAware_Article.docx
+++ b/02_Article/DisasterAware_Article.docx
@@ -75,7 +75,7 @@
           <w:sz w:val="22"/>
           <w:szCs w:val="22"/>
         </w:rPr>
-        <w:t>Çağlar Akman and Mehmet Kemal Leblebicioğlu</w:t>
+        <w:t>Çağlar Akman and Kemal Leblebicioğlu</w:t>
       </w:r>
       <w:r>
         <w:rPr>
@@ -1131,7 +1131,7 @@
           <w:sz w:val="16"/>
           <w:szCs w:val="16"/>
         </w:rPr>
-        <w:t>Çağlar Akman and Mehmet Kemal Leblebicioğlu are with the Department of Electrical and Electronics Engineering, Middle East Technical University, 06800 Ankara, Türkiye.</w:t>
+        <w:t>Çağlar Akman and Kemal Leblebicioğlu are with the Department of Electrical and Electronics Engineering, Middle East Technical University, 06800 Ankara, Türkiye.</w:t>
       </w:r>
       <w:r>
         <w:rPr>

</xml_diff>

<commit_message>
Article: write Abstract and Index Terms (publication-ready, adapted from thesis)
</commit_message>
<xml_diff>
--- a/02_Article/DisasterAware_Article.docx
+++ b/02_Article/DisasterAware_Article.docx
@@ -211,11 +211,12 @@
       </w:r>
       <w:r>
         <w:rPr>
-          <w:b w:val="0"/>
+          <w:b/>
+          <w:i w:val="0"/>
           <w:sz w:val="18"/>
           <w:szCs w:val="18"/>
         </w:rPr>
-        <w:t>[Abstract to be written.]</w:t>
+        <w:t>Existing wildfire decision support systems (DSSs) are constrained by closed decision spaces, centralized reasoning, tight coupling between simulation and decision making, and weak representation of epistemic uncertainty. This article presents DisasterAware, a hierarchically distributed, explainable, and uncertainty-aware DSS framework built on concept-based fuzzy reasoning. Six bounded environmental features are fuzzified under a partition-of-unity design and abstracted into a four-dimensional situational concept vector—fire threat, suppression feasibility, asset exposure, and intervention urgency—that drives a Mamdani-type inference pipeline distributed across regional agents. The concept-mediated rule organization yields a proven ninefold reduction in per-intervention rule complexity (from 729 to 81 rules; 351 versus 2187 rules in total), substantially improving scalability. We establish formal guarantees of output boundedness, Lipschitz continuity, and structural compliance with partial observability, and introduce confidence-gated concept modulation that encodes epistemic uncertainty without probabilistic assumptions. A non-inferential global coordination operator assembles resource-normalized regional fields into an intervention input that is strictly separated from the simulation state, while an Explainability and AI Governance Layer provides rule-level traceability, audit logging, and operator override. Comparative simulation against a functionally equivalent centralized baseline validates the adaptability, interpretability, and operational feasibility of the proposed framework, positioning DisasterAware as a reproducible alternative to optimization-based and black-box artificial-intelligence approaches to wildfire decision support.</w:t>
       </w:r>
       <w:r>
         <w:rPr>
@@ -399,11 +400,12 @@
       </w:r>
       <w:r>
         <w:rPr>
-          <w:b w:val="0"/>
+          <w:b/>
+          <w:i w:val="0"/>
           <w:sz w:val="18"/>
           <w:szCs w:val="18"/>
         </w:rPr>
-        <w:t>[Keywords to be added.]</w:t>
+        <w:t>Concept-based fuzzy reasoning, decision support systems, explainable artificial intelligence, hierarchically distributed multi-agent systems, partial observability, wildfire response management.</w:t>
       </w:r>
       <w:r>
         <w:rPr>

</xml_diff>

<commit_message>
Article: restore section/subsection headings (II-IX, Acknowledgment); fix references and Manage Sources
- Re-add 23 bibliography sources to Manage Sources (customXml) dropped on a prior Word save
- Rebuild References list (was 'no sources'); inline CITATION fields resolve to [1]-[23]
- Remove Fig.1 and Coverage table per request; keep Mapping table; convert coverage info to text
- Numbered items use List Paragraph; body paragraphs use PARA_Indent
- VII heading aligned to roadmap (Traceability)
</commit_message>
<xml_diff>
--- a/02_Article/DisasterAware_Article.docx
+++ b/02_Article/DisasterAware_Article.docx
@@ -1,6 +1,6 @@
 
 <file path=word/document.xml><?xml version="1.0" encoding="utf-8"?>
-<w:document xmlns:wpc="http://schemas.microsoft.com/office/word/2010/wordprocessingCanvas" xmlns:cx="http://schemas.microsoft.com/office/drawing/2014/chartex" xmlns:cx1="http://schemas.microsoft.com/office/drawing/2015/9/8/chartex" xmlns:cx2="http://schemas.microsoft.com/office/drawing/2015/10/21/chartex" xmlns:cx3="http://schemas.microsoft.com/office/drawing/2016/5/9/chartex" xmlns:cx4="http://schemas.microsoft.com/office/drawing/2016/5/10/chartex" xmlns:cx5="http://schemas.microsoft.com/office/drawing/2016/5/11/chartex" xmlns:cx6="http://schemas.microsoft.com/office/drawing/2016/5/12/chartex" xmlns:cx7="http://schemas.microsoft.com/office/drawing/2016/5/13/chartex" xmlns:cx8="http://schemas.microsoft.com/office/drawing/2016/5/14/chartex" xmlns:mc="http://schemas.openxmlformats.org/markup-compatibility/2006" xmlns:aink="http://schemas.microsoft.com/office/drawing/2016/ink" xmlns:am3d="http://schemas.microsoft.com/office/drawing/2017/model3d" xmlns:o="urn:schemas-microsoft-com:office:office" xmlns:oel="http://schemas.microsoft.com/office/2019/extlst" xmlns:r="http://schemas.openxmlformats.org/officeDocument/2006/relationships" xmlns:m="http://schemas.openxmlformats.org/officeDocument/2006/math" xmlns:v="urn:schemas-microsoft-com:vml" xmlns:wp14="http://schemas.microsoft.com/office/word/2010/wordprocessingDrawing" xmlns:wp="http://schemas.openxmlformats.org/drawingml/2006/wordprocessingDrawing" xmlns:w10="urn:schemas-microsoft-com:office:word" xmlns:w="http://schemas.openxmlformats.org/wordprocessingml/2006/main" xmlns:w14="http://schemas.microsoft.com/office/word/2010/wordml" xmlns:w15="http://schemas.microsoft.com/office/word/2012/wordml" xmlns:w16cex="http://schemas.microsoft.com/office/word/2018/wordml/cex" xmlns:w16cid="http://schemas.microsoft.com/office/word/2016/wordml/cid" xmlns:w16="http://schemas.microsoft.com/office/word/2018/wordml" xmlns:w16du="http://schemas.microsoft.com/office/word/2023/wordml/word16du" xmlns:w16sdtdh="http://schemas.microsoft.com/office/word/2020/wordml/sdtdatahash" xmlns:w16se="http://schemas.microsoft.com/office/word/2015/wordml/symex" xmlns:wpg="http://schemas.microsoft.com/office/word/2010/wordprocessingGroup" xmlns:wpi="http://schemas.microsoft.com/office/word/2010/wordprocessingInk" xmlns:wne="http://schemas.microsoft.com/office/word/2006/wordml" xmlns:wps="http://schemas.microsoft.com/office/word/2010/wordprocessingShape" mc:Ignorable="w14 w15 w16se w16cid w16 w16cex w16sdtdh w16du wp14">
+<w:document xmlns:wpc="http://schemas.microsoft.com/office/word/2010/wordprocessingCanvas" xmlns:cx="http://schemas.microsoft.com/office/drawing/2014/chartex" xmlns:cx1="http://schemas.microsoft.com/office/drawing/2015/9/8/chartex" xmlns:cx2="http://schemas.microsoft.com/office/drawing/2015/10/21/chartex" xmlns:cx3="http://schemas.microsoft.com/office/drawing/2016/5/9/chartex" xmlns:cx4="http://schemas.microsoft.com/office/drawing/2016/5/10/chartex" xmlns:cx5="http://schemas.microsoft.com/office/drawing/2016/5/11/chartex" xmlns:cx6="http://schemas.microsoft.com/office/drawing/2016/5/12/chartex" xmlns:cx7="http://schemas.microsoft.com/office/drawing/2016/5/13/chartex" xmlns:cx8="http://schemas.microsoft.com/office/drawing/2016/5/14/chartex" xmlns:mc="http://schemas.openxmlformats.org/markup-compatibility/2006" xmlns:aink="http://schemas.microsoft.com/office/drawing/2016/ink" xmlns:am3d="http://schemas.microsoft.com/office/drawing/2017/model3d" xmlns:o="urn:schemas-microsoft-com:office:office" xmlns:oel="http://schemas.microsoft.com/office/2019/extlst" xmlns:r="http://schemas.openxmlformats.org/officeDocument/2006/relationships" xmlns:m="http://schemas.openxmlformats.org/officeDocument/2006/math" xmlns:v="urn:schemas-microsoft-com:vml" xmlns:wp14="http://schemas.microsoft.com/office/word/2010/wordprocessingDrawing" xmlns:wp="http://schemas.openxmlformats.org/drawingml/2006/wordprocessingDrawing" xmlns:w10="urn:schemas-microsoft-com:office:word" xmlns:w="http://schemas.openxmlformats.org/wordprocessingml/2006/main" xmlns:w14="http://schemas.microsoft.com/office/word/2010/wordml" xmlns:w15="http://schemas.microsoft.com/office/word/2012/wordml" xmlns:w16cex="http://schemas.microsoft.com/office/word/2018/wordml/cex" xmlns:w16cid="http://schemas.microsoft.com/office/word/2016/wordml/cid" xmlns:w16="http://schemas.microsoft.com/office/word/2018/wordml" xmlns:w16du="http://schemas.microsoft.com/office/word/2023/wordml/word16du" xmlns:w16sdtdh="http://schemas.microsoft.com/office/word/2020/wordml/sdtdatahash" xmlns:w16sdtfl="http://schemas.microsoft.com/office/word/2024/wordml/sdtformatlock" xmlns:w16se="http://schemas.microsoft.com/office/word/2015/wordml/symex" xmlns:wpg="http://schemas.microsoft.com/office/word/2010/wordprocessingGroup" xmlns:wpi="http://schemas.microsoft.com/office/word/2010/wordprocessingInk" xmlns:wne="http://schemas.microsoft.com/office/word/2006/wordml" xmlns:wps="http://schemas.microsoft.com/office/word/2010/wordprocessingShape" mc:Ignorable="w14 w15 w16se w16cid w16 w16cex w16sdtdh w16sdtfl w16du wp14">
   <w:body>
     <w:p>
       <w:pPr>
@@ -10,27 +10,6 @@
       <w:r>
         <w:t>Concept-Based Fuzzy Reasoning for Scalable Wildfire Decision Support (DisasterAware)</w:t>
       </w:r>
-      <w:r>
-        <w:rPr>
-          <w:sz w:val="40"/>
-          <w:szCs w:val="40"/>
-        </w:rPr>
-      </w:r>
-      <w:r/>
-      <w:r>
-        <w:rPr>
-          <w:sz w:val="40"/>
-          <w:szCs w:val="40"/>
-        </w:rPr>
-      </w:r>
-      <w:r>
-        <w:rPr>
-          <w:i/>
-        </w:rPr>
-      </w:r>
-      <w:r/>
-      <w:r/>
-      <w:r/>
     </w:p>
     <w:p>
       <w:pPr>
@@ -76,29 +55,6 @@
           <w:szCs w:val="22"/>
         </w:rPr>
         <w:t>Çağlar Akman and Kemal Leblebicioğlu</w:t>
-      </w:r>
-      <w:r>
-        <w:rPr>
-          <w:i/>
-          <w:color w:val="000000"/>
-          <w:sz w:val="22"/>
-          <w:szCs w:val="22"/>
-        </w:rPr>
-      </w:r>
-      <w:r>
-        <w:rPr>
-          <w:color w:val="000000"/>
-          <w:sz w:val="22"/>
-          <w:szCs w:val="22"/>
-        </w:rPr>
-      </w:r>
-      <w:r>
-        <w:rPr>
-          <w:i/>
-          <w:color w:val="000000"/>
-          <w:sz w:val="22"/>
-          <w:szCs w:val="22"/>
-        </w:rPr>
       </w:r>
     </w:p>
     <w:p>
@@ -212,161 +168,28 @@
       <w:r>
         <w:rPr>
           <w:b/>
-          <w:i w:val="0"/>
           <w:sz w:val="18"/>
           <w:szCs w:val="18"/>
         </w:rPr>
-        <w:t>Existing wildfire decision support systems (DSSs) are constrained by closed decision spaces, centralized reasoning, tight coupling between simulation and decision making, and weak representation of epistemic uncertainty. This article presents DisasterAware, a hierarchically distributed, explainable, and uncertainty-aware DSS framework built on concept-based fuzzy reasoning. Six bounded environmental features are fuzzified under a partition-of-unity design and abstracted into a four-dimensional situational concept vector—fire threat, suppression feasibility, asset exposure, and intervention urgency—that drives a Mamdani-type inference pipeline distributed across regional agents. The concept-mediated rule organization yields a proven ninefold reduction in per-intervention rule complexity (from 729 to 81 rules; 351 versus 2187 rules in total), substantially improving scalability. We establish formal guarantees of output boundedness, Lipschitz continuity, and structural compliance with partial observability, and introduce confidence-gated concept modulation that encodes epistemic uncertainty without probabilistic assumptions. A non-inferential global coordination operator assembles resource-normalized regional fields into an intervention input that is strictly separated from the simulation state, while an Explainability and AI Governance Layer provides rule-level traceability, audit logging, and operator override. Comparative simulation against a functionally equivalent centralized baseline validates the adaptability, interpretability, and operational feasibility of the proposed framework, positioning DisasterAware as a reproducible alternative to optimization-based and black-box artificial-intelligence approaches to wildfire decision support.</w:t>
-      </w:r>
-      <w:r>
-        <w:rPr>
-          <w:b/>
-          <w:color w:val="000000"/>
-          <w:sz w:val="18"/>
-          <w:szCs w:val="18"/>
-        </w:rPr>
-      </w:r>
+        <w:t xml:space="preserve">Wildfire decision support systems today remain limited in several ways. They typically operate within a fixed set of predefined options, concentrate reasoning in a single central unit, tie the decision logic tightly to one specific simulation model, and cope poorly with uncertain or missing information. DisasterAware is a decision support framework that addresses these limitations through a hierarchically distributed and uncertainty-aware design based on concept-based fuzzy reasoning. Six bounded environmental features are first converted into fuzzy membership values under a partition-of-unity scheme and then abstracted into a compact four-dimensional situational concept vector (fire threat, suppression feasibility, asset exposure, and intervention urgency). This concept vector feeds a Mamdani-type inference process that runs independently on each regional agent. Organizing the rules around concepts rather than raw features reduces the rule count ninefold for every intervention type, from 729 to 81 </w:t>
+      </w:r>
+      <w:proofErr w:type="spellStart"/>
       <w:r>
         <w:rPr>
           <w:b/>
           <w:sz w:val="18"/>
           <w:szCs w:val="18"/>
         </w:rPr>
-      </w:r>
-      <w:r>
-        <w:rPr>
-          <w:b/>
-          <w:color w:val="000000"/>
-          <w:sz w:val="18"/>
-          <w:szCs w:val="18"/>
-        </w:rPr>
-      </w:r>
+        <w:t>rules</w:t>
+      </w:r>
+      <w:proofErr w:type="spellEnd"/>
       <w:r>
         <w:rPr>
           <w:b/>
           <w:sz w:val="18"/>
           <w:szCs w:val="18"/>
         </w:rPr>
-      </w:r>
-      <w:r>
-        <w:rPr>
-          <w:b/>
-          <w:color w:val="000000"/>
-          <w:sz w:val="18"/>
-          <w:szCs w:val="18"/>
-        </w:rPr>
-      </w:r>
-      <w:r>
-        <w:rPr>
-          <w:b/>
-          <w:i/>
-          <w:color w:val="000000"/>
-          <w:sz w:val="18"/>
-          <w:szCs w:val="18"/>
-        </w:rPr>
-      </w:r>
-      <w:r>
-        <w:rPr>
-          <w:b/>
-          <w:color w:val="000000"/>
-          <w:sz w:val="18"/>
-          <w:szCs w:val="18"/>
-        </w:rPr>
-      </w:r>
-      <w:r>
-        <w:rPr>
-          <w:b/>
-          <w:i/>
-          <w:color w:val="000000"/>
-          <w:sz w:val="18"/>
-          <w:szCs w:val="18"/>
-        </w:rPr>
-      </w:r>
-      <w:r>
-        <w:rPr>
-          <w:b/>
-          <w:color w:val="000000"/>
-          <w:sz w:val="18"/>
-          <w:szCs w:val="18"/>
-        </w:rPr>
-      </w:r>
-      <w:r>
-        <w:rPr>
-          <w:b/>
-          <w:color w:val="000000"/>
-          <w:sz w:val="18"/>
-          <w:szCs w:val="18"/>
-        </w:rPr>
-      </w:r>
-      <w:r>
-        <w:rPr>
-          <w:b/>
-          <w:color w:val="000000"/>
-          <w:sz w:val="18"/>
-          <w:szCs w:val="18"/>
-        </w:rPr>
-      </w:r>
-      <w:r>
-        <w:rPr>
-          <w:b/>
-          <w:color w:val="000000"/>
-          <w:sz w:val="18"/>
-          <w:szCs w:val="18"/>
-        </w:rPr>
-      </w:r>
-      <w:r>
-        <w:rPr>
-          <w:b/>
-          <w:color w:val="000000"/>
-          <w:sz w:val="18"/>
-          <w:szCs w:val="18"/>
-        </w:rPr>
-      </w:r>
-      <w:r>
-        <w:rPr>
-          <w:b/>
-          <w:sz w:val="18"/>
-          <w:szCs w:val="18"/>
-        </w:rPr>
-      </w:r>
-      <w:r>
-        <w:rPr>
-          <w:b/>
-          <w:i/>
-          <w:sz w:val="18"/>
-          <w:szCs w:val="18"/>
-        </w:rPr>
-      </w:r>
-      <w:r>
-        <w:rPr>
-          <w:b/>
-          <w:sz w:val="18"/>
-          <w:szCs w:val="18"/>
-        </w:rPr>
-      </w:r>
-      <w:proofErr w:type="spellStart"/>
-      <w:r>
-        <w:rPr>
-          <w:b/>
-          <w:sz w:val="18"/>
-          <w:szCs w:val="18"/>
-        </w:rPr>
-      </w:r>
-      <w:proofErr w:type="spellEnd"/>
-      <w:r>
-        <w:rPr>
-          <w:b/>
-          <w:sz w:val="18"/>
-          <w:szCs w:val="18"/>
-        </w:rPr>
-      </w:r>
-      <w:r>
-        <w:rPr>
-          <w:b/>
-          <w:color w:val="000000"/>
-          <w:sz w:val="18"/>
-          <w:szCs w:val="18"/>
-        </w:rPr>
+        <w:t xml:space="preserve"> (351 instead of 2187 rules in total), which keeps the system scalable as the problem grows. The framework also provides formal guarantees on the boundedness and Lipschitz continuity of its outputs and on its compliance with partial observability, and it represents incomplete knowledge through a confidence-gated modulation of the concepts that requires no probabilistic assumptions. A non-inferential global coordination operator then combines the resource-normalized regional outputs into a single intervention input that stays strictly separate from the simulation state. Tested in simulation against a comparable centralized baseline, DisasterAware shows strong adaptability and operational feasibility, offering a reproducible alternative to optimization-based and black-box approaches to wildfire decision support.</w:t>
       </w:r>
     </w:p>
     <w:p/>
@@ -401,102 +224,10 @@
       <w:r>
         <w:rPr>
           <w:b/>
-          <w:i w:val="0"/>
           <w:sz w:val="18"/>
           <w:szCs w:val="18"/>
         </w:rPr>
-        <w:t>Concept-based fuzzy reasoning, decision support systems, explainable artificial intelligence, hierarchically distributed multi-agent systems, partial observability, wildfire response management.</w:t>
-      </w:r>
-      <w:r>
-        <w:rPr>
-          <w:b/>
-          <w:sz w:val="18"/>
-          <w:szCs w:val="18"/>
-          <w:shd w:val="clear" w:color="auto" w:fill="FFFFFF"/>
-        </w:rPr>
-      </w:r>
-      <w:r>
-        <w:rPr>
-          <w:rStyle w:val="Emphasis"/>
-          <w:b/>
-          <w:color w:val="000000"/>
-          <w:sz w:val="18"/>
-          <w:szCs w:val="18"/>
-          <w:shd w:val="clear" w:color="auto" w:fill="FFFFFF"/>
-        </w:rPr>
-      </w:r>
-      <w:r>
-        <w:rPr>
-          <w:b/>
-          <w:sz w:val="18"/>
-          <w:szCs w:val="18"/>
-          <w:shd w:val="clear" w:color="auto" w:fill="FFFFFF"/>
-        </w:rPr>
-      </w:r>
-      <w:r>
-        <w:rPr>
-          <w:b/>
-          <w:sz w:val="18"/>
-          <w:szCs w:val="18"/>
-          <w:shd w:val="clear" w:color="auto" w:fill="FFFFFF"/>
-        </w:rPr>
-      </w:r>
-      <w:r>
-        <w:rPr>
-          <w:b/>
-          <w:sz w:val="18"/>
-          <w:szCs w:val="18"/>
-        </w:rPr>
-      </w:r>
-      <w:r>
-        <w:rPr>
-          <w:b/>
-          <w:sz w:val="18"/>
-          <w:szCs w:val="18"/>
-          <w:shd w:val="clear" w:color="auto" w:fill="FFFFFF"/>
-        </w:rPr>
-      </w:r>
-      <w:r>
-        <w:rPr>
-          <w:rStyle w:val="Emphasis"/>
-          <w:b/>
-          <w:color w:val="000000"/>
-          <w:sz w:val="18"/>
-          <w:szCs w:val="18"/>
-          <w:shd w:val="clear" w:color="auto" w:fill="FFFFFF"/>
-        </w:rPr>
-      </w:r>
-      <w:r>
-        <w:rPr>
-          <w:rStyle w:val="Emphasis"/>
-          <w:b/>
-          <w:color w:val="000000"/>
-          <w:sz w:val="18"/>
-          <w:szCs w:val="18"/>
-          <w:shd w:val="clear" w:color="auto" w:fill="FFFFFF"/>
-        </w:rPr>
-      </w:r>
-      <w:r>
-        <w:rPr>
-          <w:rFonts w:ascii="Georgia" w:hAnsi="Georgia"/>
-          <w:color w:val="222222"/>
-          <w:shd w:val="clear" w:color="auto" w:fill="FFFFFF"/>
-        </w:rPr>
-      </w:r>
-      <w:r>
-        <w:rPr>
-          <w:color w:val="1155CC"/>
-          <w:spacing w:val="-2"/>
-          <w:u w:val="single"/>
-        </w:rPr>
-      </w:r>
-      <w:r>
-        <w:rPr>
-          <w:b/>
-          <w:sz w:val="18"/>
-          <w:szCs w:val="18"/>
-          <w:shd w:val="clear" w:color="auto" w:fill="FFFFFF"/>
-        </w:rPr>
+        <w:t>Concept-based fuzzy reasoning, decision support systems, hierarchically distributed multi-agent systems, partial observability, wildfire response management.</w:t>
       </w:r>
     </w:p>
     <w:p>
@@ -517,11 +248,1063 @@
         <w:pStyle w:val="Heading1"/>
       </w:pPr>
       <w:r>
-        <w:t>I. Introduction</w:t>
-      </w:r>
-    </w:p>
-    <w:p>
-      <w:pPr/>
+        <w:t xml:space="preserve">I. </w:t>
+      </w:r>
+      <w:r>
+        <w:t>I</w:t>
+      </w:r>
+      <w:r>
+        <w:t>NTRODUCTION</w:t>
+      </w:r>
+    </w:p>
+    <w:p>
+      <w:pPr>
+        <w:keepNext/>
+        <w:framePr w:dropCap="drop" w:lines="3" w:wrap="around" w:vAnchor="text" w:hAnchor="text" w:y="1"/>
+        <w:pBdr>
+          <w:top w:val="nil"/>
+          <w:left w:val="nil"/>
+        </w:pBdr>
+        <w:spacing w:line="724" w:lineRule="exact"/>
+        <w:jc w:val="both"/>
+        <w:textAlignment w:val="baseline"/>
+        <w:rPr>
+          <w:smallCaps/>
+          <w:color w:val="000000"/>
+          <w:position w:val="-9"/>
+          <w:sz w:val="97"/>
+        </w:rPr>
+      </w:pPr>
+      <w:r>
+        <w:rPr>
+          <w:smallCaps/>
+          <w:color w:val="000000"/>
+          <w:position w:val="-9"/>
+          <w:sz w:val="97"/>
+        </w:rPr>
+        <w:t>W</w:t>
+      </w:r>
+    </w:p>
+    <w:p>
+      <w:pPr>
+        <w:pStyle w:val="PARAIndent"/>
+        <w:ind w:firstLine="0"/>
+      </w:pPr>
+      <w:r>
+        <w:t xml:space="preserve">ildfires have grown more frequent and more destructive over recent decades, and the conditions that drive them are intensifying across </w:t>
+      </w:r>
+      <w:r>
+        <w:t>most</w:t>
+      </w:r>
+      <w:r>
+        <w:t xml:space="preserve"> fire-prone regions of the world </w:t>
+      </w:r>
+      <w:r>
+        <w:fldChar w:fldCharType="begin"/>
+      </w:r>
+      <w:r>
+        <w:instrText xml:space="preserve"> CITATION Jol15 \l 1033 </w:instrText>
+      </w:r>
+      <w:r>
+        <w:fldChar w:fldCharType="separate"/>
+      </w:r>
+      <w:r>
+        <w:t>[1]</w:t>
+      </w:r>
+      <w:r>
+        <w:fldChar w:fldCharType="end"/>
+      </w:r>
+      <w:r>
+        <w:t xml:space="preserve">. When a large fire is active, incident commanders must decide where to send limited crews, which areas to protect first, and whether to attempt direct suppression. These choices are made quickly, under heavy time pressure, and on the basis of information that is always incomplete. Decision support systems (DSSs) were introduced to help with this kind of problem by </w:t>
+      </w:r>
+      <w:r>
+        <w:t>turning</w:t>
+      </w:r>
+      <w:r>
+        <w:t xml:space="preserve"> </w:t>
+      </w:r>
+      <w:r>
+        <w:t xml:space="preserve">heterogeneous data into structured guidance for human decision makers </w:t>
+      </w:r>
+      <w:r>
+        <w:fldChar w:fldCharType="begin"/>
+      </w:r>
+      <w:r>
+        <w:instrText xml:space="preserve"> CITATION Shi02 \l 1033 </w:instrText>
+      </w:r>
+      <w:r>
+        <w:fldChar w:fldCharType="separate"/>
+      </w:r>
+      <w:r>
+        <w:t>[2]</w:t>
+      </w:r>
+      <w:r>
+        <w:fldChar w:fldCharType="end"/>
+      </w:r>
+      <w:r>
+        <w:t xml:space="preserve">. In wildfire </w:t>
+      </w:r>
+      <w:proofErr w:type="gramStart"/>
+      <w:r>
+        <w:t>response,  Reported</w:t>
+      </w:r>
+      <w:proofErr w:type="gramEnd"/>
+      <w:r>
+        <w:t xml:space="preserve"> global disaster counts confirm this upward trend over the same period </w:t>
+      </w:r>
+      <w:r>
+        <w:fldChar w:fldCharType="begin"/>
+      </w:r>
+      <w:r>
+        <w:instrText xml:space="preserve"> CITATION EMDAT \l 1033 </w:instrText>
+      </w:r>
+      <w:r>
+        <w:fldChar w:fldCharType="separate"/>
+      </w:r>
+      <w:r>
+        <w:t>[3]</w:t>
+      </w:r>
+      <w:r>
+        <w:fldChar w:fldCharType="end"/>
+      </w:r>
+      <w:r>
+        <w:t>.</w:t>
+      </w:r>
+    </w:p>
+    <w:p>
+      <w:pPr>
+        <w:pStyle w:val="PARAIndent"/>
+      </w:pPr>
+      <w:r>
+        <w:t xml:space="preserve">Several mature tools already support parts of this task. The U.S. Wildland Fire Decision Support System integrates weather, fire behavior, and economic information for incident-level decisions </w:t>
+      </w:r>
+      <w:r>
+        <w:fldChar w:fldCharType="begin"/>
+      </w:r>
+      <w:r>
+        <w:instrText xml:space="preserve"> CITATION Noo11 \l 1033 </w:instrText>
+      </w:r>
+      <w:r>
+        <w:fldChar w:fldCharType="separate"/>
+      </w:r>
+      <w:r>
+        <w:t>[4]</w:t>
+      </w:r>
+      <w:r>
+        <w:fldChar w:fldCharType="end"/>
+      </w:r>
+      <w:r>
+        <w:t xml:space="preserve">. Fire behavior models such as FlamMap </w:t>
+      </w:r>
+      <w:r>
+        <w:fldChar w:fldCharType="begin"/>
+      </w:r>
+      <w:r>
+        <w:instrText xml:space="preserve"> CITATION Fin06 \l 1033 </w:instrText>
+      </w:r>
+      <w:r>
+        <w:fldChar w:fldCharType="separate"/>
+      </w:r>
+      <w:r>
+        <w:t>[5]</w:t>
+      </w:r>
+      <w:r>
+        <w:fldChar w:fldCharType="end"/>
+      </w:r>
+      <w:r>
+        <w:t xml:space="preserve">, built on the Rothermel spread model </w:t>
+      </w:r>
+      <w:r>
+        <w:fldChar w:fldCharType="begin"/>
+      </w:r>
+      <w:r>
+        <w:instrText xml:space="preserve"> CITATION Rot72 \l 1033 </w:instrText>
+      </w:r>
+      <w:r>
+        <w:fldChar w:fldCharType="separate"/>
+      </w:r>
+      <w:r>
+        <w:t>[6]</w:t>
+      </w:r>
+      <w:r>
+        <w:fldChar w:fldCharType="end"/>
+      </w:r>
+      <w:r>
+        <w:t xml:space="preserve">, predict how a fire moves across a landscape. Operations research has produced optimization models that allocate suppression resources and plan evacuations </w:t>
+      </w:r>
+      <w:r>
+        <w:fldChar w:fldCharType="begin"/>
+      </w:r>
+      <w:r>
+        <w:instrText xml:space="preserve"> CITATION Zho19 \l 1033 </w:instrText>
+      </w:r>
+      <w:r>
+        <w:fldChar w:fldCharType="separate"/>
+      </w:r>
+      <w:r>
+        <w:t>[7]</w:t>
+      </w:r>
+      <w:r>
+        <w:fldChar w:fldCharType="end"/>
+      </w:r>
+      <w:r>
+        <w:t xml:space="preserve">, and multi-criteria methods rank predefined response options against weighted criteria </w:t>
+      </w:r>
+      <w:r>
+        <w:fldChar w:fldCharType="begin"/>
+      </w:r>
+      <w:r>
+        <w:instrText xml:space="preserve"> CITATION Tri00 \l 1033 </w:instrText>
+      </w:r>
+      <w:r>
+        <w:fldChar w:fldCharType="separate"/>
+      </w:r>
+      <w:r>
+        <w:t>[8]</w:t>
+      </w:r>
+      <w:r>
+        <w:fldChar w:fldCharType="end"/>
+      </w:r>
+      <w:r>
+        <w:t xml:space="preserve">. More recently, machine learning has been applied to spread prediction using large remote-sensing datasets </w:t>
+      </w:r>
+      <w:r>
+        <w:fldChar w:fldCharType="begin"/>
+      </w:r>
+      <w:r>
+        <w:instrText xml:space="preserve"> CITATION Huo22 \l 1033 </w:instrText>
+      </w:r>
+      <w:r>
+        <w:fldChar w:fldCharType="separate"/>
+      </w:r>
+      <w:r>
+        <w:t>[9]</w:t>
+      </w:r>
+      <w:r>
+        <w:fldChar w:fldCharType="end"/>
+      </w:r>
+      <w:r>
+        <w:t xml:space="preserve">, and hybrid designs have begun to pair transformer-based prediction with fuzzy rule-based response logic </w:t>
+      </w:r>
+      <w:r>
+        <w:fldChar w:fldCharType="begin"/>
+      </w:r>
+      <w:r>
+        <w:instrText xml:space="preserve"> CITATION Dub25 \l 1033 </w:instrText>
+      </w:r>
+      <w:r>
+        <w:fldChar w:fldCharType="separate"/>
+      </w:r>
+      <w:r>
+        <w:t>[10]</w:t>
+      </w:r>
+      <w:r>
+        <w:fldChar w:fldCharType="end"/>
+      </w:r>
+      <w:r>
+        <w:t>. Each tool is effective within its intended scope.</w:t>
+      </w:r>
+    </w:p>
+    <w:p>
+      <w:pPr>
+        <w:pStyle w:val="PARAIndent"/>
+      </w:pPr>
+      <w:r>
+        <w:t xml:space="preserve">Several of these tools address only part of this set of gaps, including WFDSS </w:t>
+      </w:r>
+      <w:r>
+        <w:fldChar w:fldCharType="begin"/>
+      </w:r>
+      <w:r>
+        <w:instrText xml:space="preserve"> CITATION Noo11 \l 1033 </w:instrText>
+      </w:r>
+      <w:r>
+        <w:fldChar w:fldCharType="separate"/>
+      </w:r>
+      <w:r>
+        <w:t>[4]</w:t>
+      </w:r>
+      <w:r>
+        <w:fldChar w:fldCharType="end"/>
+      </w:r>
+      <w:r>
+        <w:t xml:space="preserve">, FlamMap </w:t>
+      </w:r>
+      <w:r>
+        <w:fldChar w:fldCharType="begin"/>
+      </w:r>
+      <w:r>
+        <w:instrText xml:space="preserve"> CITATION Fin06 \l 1033 </w:instrText>
+      </w:r>
+      <w:r>
+        <w:fldChar w:fldCharType="separate"/>
+      </w:r>
+      <w:r>
+        <w:t>[5]</w:t>
+      </w:r>
+      <w:r>
+        <w:fldChar w:fldCharType="end"/>
+      </w:r>
+      <w:r>
+        <w:t xml:space="preserve">, the MORA toolkit </w:t>
+      </w:r>
+      <w:r>
+        <w:fldChar w:fldCharType="begin"/>
+      </w:r>
+      <w:r>
+        <w:instrText xml:space="preserve"> CITATION Orp25 \l 1033 </w:instrText>
+      </w:r>
+      <w:r>
+        <w:fldChar w:fldCharType="separate"/>
+      </w:r>
+      <w:r>
+        <w:t>[11]</w:t>
+      </w:r>
+      <w:r>
+        <w:fldChar w:fldCharType="end"/>
+      </w:r>
+      <w:r>
+        <w:t xml:space="preserve">, an integrated suppression DSS </w:t>
+      </w:r>
+      <w:r>
+        <w:fldChar w:fldCharType="begin"/>
+      </w:r>
+      <w:r>
+        <w:instrText xml:space="preserve"> CITATION Lou21 \l 1033 </w:instrText>
+      </w:r>
+      <w:r>
+        <w:fldChar w:fldCharType="separate"/>
+      </w:r>
+      <w:r>
+        <w:t>[12]</w:t>
+      </w:r>
+      <w:r>
+        <w:fldChar w:fldCharType="end"/>
+      </w:r>
+      <w:r>
+        <w:t xml:space="preserve">, and a transformer-fuzzy hybrid </w:t>
+      </w:r>
+      <w:r>
+        <w:fldChar w:fldCharType="begin"/>
+      </w:r>
+      <w:r>
+        <w:instrText xml:space="preserve"> CITATION Dub25 \l 1033 </w:instrText>
+      </w:r>
+      <w:r>
+        <w:fldChar w:fldCharType="separate"/>
+      </w:r>
+      <w:r>
+        <w:t>[10]</w:t>
+      </w:r>
+      <w:r>
+        <w:fldChar w:fldCharType="end"/>
+      </w:r>
+      <w:r>
+        <w:t>.</w:t>
+      </w:r>
+    </w:p>
+    <w:p>
+      <w:pPr>
+        <w:pStyle w:val="PARAIndent"/>
+      </w:pPr>
+      <w:r>
+        <w:t xml:space="preserve">Viewed together as decision-generation systems, however, these approaches share several structural limitations. Most operate over a closed set of predefined options, so any action outside that set is unavailable. Reasoning is usually centralized, which makes it hard to reflect the regional structure of a large fire. The decision logic is often tied tightly to one simulation model, so the two cannot evolve separately. Uncertainty is either ignored or forced into probabilistic form, even though the missing information in wildfire response rarely has known statistical properties </w:t>
+      </w:r>
+      <w:r>
+        <w:fldChar w:fldCharType="begin"/>
+      </w:r>
+      <w:r>
+        <w:instrText xml:space="preserve"> CITATION Tho11 \l 1033 </w:instrText>
+      </w:r>
+      <w:r>
+        <w:fldChar w:fldCharType="separate"/>
+      </w:r>
+      <w:r>
+        <w:t>[13]</w:t>
+      </w:r>
+      <w:r>
+        <w:fldChar w:fldCharType="end"/>
+      </w:r>
+      <w:r>
+        <w:t xml:space="preserve">. Explanations, when offered, often rely on post-hoc attribution methods such as SHAP </w:t>
+      </w:r>
+      <w:r>
+        <w:fldChar w:fldCharType="begin"/>
+      </w:r>
+      <w:r>
+        <w:instrText xml:space="preserve"> CITATION Lun17 \l 1033 </w:instrText>
+      </w:r>
+      <w:r>
+        <w:fldChar w:fldCharType="separate"/>
+      </w:r>
+      <w:r>
+        <w:t>[14]</w:t>
+      </w:r>
+      <w:r>
+        <w:fldChar w:fldCharType="end"/>
+      </w:r>
+      <w:r>
+        <w:t xml:space="preserve"> or LIME </w:t>
+      </w:r>
+      <w:r>
+        <w:fldChar w:fldCharType="begin"/>
+      </w:r>
+      <w:r>
+        <w:instrText xml:space="preserve"> CITATION Rib16 \l 1033 </w:instrText>
+      </w:r>
+      <w:r>
+        <w:fldChar w:fldCharType="separate"/>
+      </w:r>
+      <w:r>
+        <w:t>[15]</w:t>
+      </w:r>
+      <w:r>
+        <w:fldChar w:fldCharType="end"/>
+      </w:r>
+      <w:r>
+        <w:t xml:space="preserve"> that approximate a model’s behavior rather than expose the actual reasoning. Finally, decisions must be made under partial observability, a setting well understood in theory </w:t>
+      </w:r>
+      <w:r>
+        <w:fldChar w:fldCharType="begin"/>
+      </w:r>
+      <w:r>
+        <w:instrText xml:space="preserve"> CITATION Kae98 \l 1033 </w:instrText>
+      </w:r>
+      <w:r>
+        <w:fldChar w:fldCharType="separate"/>
+      </w:r>
+      <w:r>
+        <w:t>[16]</w:t>
+      </w:r>
+      <w:r>
+        <w:fldChar w:fldCharType="end"/>
+      </w:r>
+      <w:r>
+        <w:t xml:space="preserve"> but seldom handled explicitly in operational wildfire DSSs.</w:t>
+      </w:r>
+    </w:p>
+    <w:p>
+      <w:pPr>
+        <w:pStyle w:val="PARAIndent"/>
+      </w:pPr>
+      <w:r>
+        <w:t xml:space="preserve">These observations can be organized into six structural gaps that recur across the literature. G1 (closed decision spaces): actions are chosen from a fixed list rather than generated from the situation. G2 (centralized architectures): a single reasoning unit handles all regions and decision levels. G3 (no non-probabilistic uncertainty handling): epistemic uncertainty is not represented without assuming prior distributions or calibrated belief intervals </w:t>
+      </w:r>
+      <w:r>
+        <w:fldChar w:fldCharType="begin"/>
+      </w:r>
+      <w:r>
+        <w:instrText xml:space="preserve"> CITATION Sha76 \l 1033 </w:instrText>
+      </w:r>
+      <w:r>
+        <w:fldChar w:fldCharType="separate"/>
+      </w:r>
+      <w:r>
+        <w:t>[17]</w:t>
+      </w:r>
+      <w:r>
+        <w:fldChar w:fldCharType="end"/>
+      </w:r>
+      <w:r>
+        <w:t xml:space="preserve">. G4 (limited traceability): decisions cannot be traced back to the specific evidence and rules that produced them. G5 (no separation between simulation and decision logic): the decision core reads the true simulated state instead of observation-derived quantities. G6 </w:t>
+      </w:r>
+      <w:r>
+        <w:lastRenderedPageBreak/>
+        <w:t>(weak constraint integration under partial observability): constraints are imposed as if the full state were known. No single existing framework resolves all six at once.</w:t>
+      </w:r>
+    </w:p>
+    <w:p>
+      <w:pPr>
+        <w:pStyle w:val="PARAIndent"/>
+      </w:pPr>
+      <w:r>
+        <w:t xml:space="preserve">This article presents DisasterAware, a hierarchically distributed and uncertainty-aware DSS framework that addresses these gaps through concept-based fuzzy reasoning. The framework builds on fuzzy set theory </w:t>
+      </w:r>
+      <w:r>
+        <w:fldChar w:fldCharType="begin"/>
+      </w:r>
+      <w:r>
+        <w:instrText xml:space="preserve"> CITATION Zad65 \l 1033 </w:instrText>
+      </w:r>
+      <w:r>
+        <w:fldChar w:fldCharType="separate"/>
+      </w:r>
+      <w:r>
+        <w:t>[18]</w:t>
+      </w:r>
+      <w:r>
+        <w:fldChar w:fldCharType="end"/>
+      </w:r>
+      <w:r>
+        <w:t xml:space="preserve"> and Mamdani-type inference </w:t>
+      </w:r>
+      <w:r>
+        <w:fldChar w:fldCharType="begin"/>
+      </w:r>
+      <w:r>
+        <w:instrText xml:space="preserve"> CITATION Mam75 \l 1033 </w:instrText>
+      </w:r>
+      <w:r>
+        <w:fldChar w:fldCharType="separate"/>
+      </w:r>
+      <w:r>
+        <w:t>[19]</w:t>
+      </w:r>
+      <w:r>
+        <w:fldChar w:fldCharType="end"/>
+      </w:r>
+      <w:r>
+        <w:t xml:space="preserve">, which have a long record of use in fire-risk assessment </w:t>
+      </w:r>
+      <w:r>
+        <w:fldChar w:fldCharType="begin"/>
+      </w:r>
+      <w:r>
+        <w:instrText xml:space="preserve"> CITATION Tsa09 \l 1033 </w:instrText>
+      </w:r>
+      <w:r>
+        <w:fldChar w:fldCharType="separate"/>
+      </w:r>
+      <w:r>
+        <w:t>[20]</w:t>
+      </w:r>
+      <w:r>
+        <w:fldChar w:fldCharType="end"/>
+      </w:r>
+      <w:r>
+        <w:t xml:space="preserve">, and distributes its computation across regional agents in the spirit of multi-agent </w:t>
+      </w:r>
+      <w:r>
+        <w:fldChar w:fldCharType="begin"/>
+      </w:r>
+      <w:r>
+        <w:instrText xml:space="preserve"> CITATION Woo09 \l 1033 </w:instrText>
+      </w:r>
+      <w:r>
+        <w:fldChar w:fldCharType="separate"/>
+      </w:r>
+      <w:r>
+        <w:t>[21]</w:t>
+      </w:r>
+      <w:r>
+        <w:fldChar w:fldCharType="end"/>
+      </w:r>
+      <w:r>
+        <w:t xml:space="preserve"> and hierarchical fuzzy systems </w:t>
+      </w:r>
+      <w:r>
+        <w:fldChar w:fldCharType="begin"/>
+      </w:r>
+      <w:r>
+        <w:instrText xml:space="preserve"> CITATION Raj91 \l 1033 </w:instrText>
+      </w:r>
+      <w:r>
+        <w:fldChar w:fldCharType="separate"/>
+      </w:r>
+      <w:r>
+        <w:t>[22]</w:t>
+      </w:r>
+      <w:r>
+        <w:fldChar w:fldCharType="end"/>
+      </w:r>
+      <w:r>
+        <w:t>. Its main contributions, each aimed at a specific gap, are as follows.</w:t>
+      </w:r>
+    </w:p>
+    <w:p>
+      <w:pPr>
+        <w:pStyle w:val="ListParagraph"/>
+        <w:numPr>
+          <w:ilvl w:val="1"/>
+          <w:numId w:val="10"/>
+        </w:numPr>
+      </w:pPr>
+      <w:r>
+        <w:t>Concept abstraction layer (G1). Raw observations are mapped onto a small set of domain-meaningful concepts (fire threat, suppression feasibility, asset exposure, and intervention urgency) before any decision is made, turning a fixed menu of options into an open, situation-driven decision space.</w:t>
+      </w:r>
+    </w:p>
+    <w:p>
+      <w:pPr>
+        <w:pStyle w:val="ListParagraph"/>
+        <w:numPr>
+          <w:ilvl w:val="1"/>
+          <w:numId w:val="10"/>
+        </w:numPr>
+      </w:pPr>
+      <w:r>
+        <w:t xml:space="preserve">Hierarchically distributed inference (G2). Local fuzzy agents reason independently for their own regions, while a global coordinator assembles their outputs without performing any inference of </w:t>
+      </w:r>
+      <w:proofErr w:type="gramStart"/>
+      <w:r>
+        <w:t>its</w:t>
+      </w:r>
+      <w:proofErr w:type="gramEnd"/>
+      <w:r>
+        <w:t xml:space="preserve"> own.</w:t>
+      </w:r>
+    </w:p>
+    <w:p>
+      <w:pPr>
+        <w:pStyle w:val="ListParagraph"/>
+        <w:numPr>
+          <w:ilvl w:val="1"/>
+          <w:numId w:val="10"/>
+        </w:numPr>
+      </w:pPr>
+      <w:r>
+        <w:t>Confidence-gated concept modulation (G3). Epistemic uncertainty is propagated by blending concept values with a persistence-based prior in proportion to observation confidence, with no prior probability distribution required.</w:t>
+      </w:r>
+    </w:p>
+    <w:p>
+      <w:pPr>
+        <w:pStyle w:val="ListParagraph"/>
+        <w:numPr>
+          <w:ilvl w:val="1"/>
+          <w:numId w:val="10"/>
+        </w:numPr>
+      </w:pPr>
+      <w:r>
+        <w:t>Intrinsic traceability (G4). Every decision is linked to an explicit concept activation pattern, the rules it triggered, and the confidence of the observations behind it, so the reasoning can be inspected directly rather than approximated after the fact.</w:t>
+      </w:r>
+    </w:p>
+    <w:p>
+      <w:pPr>
+        <w:pStyle w:val="ListParagraph"/>
+        <w:numPr>
+          <w:ilvl w:val="1"/>
+          <w:numId w:val="10"/>
+        </w:numPr>
+      </w:pPr>
+      <w:r>
+        <w:t>Strict simulation-decision separation (G5). The decision core operates only on observation-derived quantities and never accesses the true simulation state.</w:t>
+      </w:r>
+    </w:p>
+    <w:p>
+      <w:pPr>
+        <w:pStyle w:val="ListParagraph"/>
+        <w:numPr>
+          <w:ilvl w:val="1"/>
+          <w:numId w:val="10"/>
+        </w:numPr>
+      </w:pPr>
+      <w:r>
+        <w:t xml:space="preserve">Satisficing-based evaluation with a graduated fail-safe (G6). Interventions are accepted when their estimated quality meets an adaptive threshold </w:t>
+      </w:r>
+      <w:r>
+        <w:fldChar w:fldCharType="begin"/>
+      </w:r>
+      <w:r>
+        <w:instrText xml:space="preserve"> CITATION Sim56 \l 1033 </w:instrText>
+      </w:r>
+      <w:r>
+        <w:fldChar w:fldCharType="separate"/>
+      </w:r>
+      <w:r>
+        <w:t>[23]</w:t>
+      </w:r>
+      <w:r>
+        <w:fldChar w:fldCharType="end"/>
+      </w:r>
+      <w:r>
+        <w:t>, and are otherwise attenuated toward a safe baseline.</w:t>
+      </w:r>
+    </w:p>
+    <w:p>
+      <w:pPr>
+        <w:pStyle w:val="PARAIndent"/>
+      </w:pPr>
+      <w:r>
+        <w:t>Table I maps each structural gap to the contribution that addresses it.</w:t>
+      </w:r>
+    </w:p>
+    <w:p>
+      <w:pPr>
+        <w:pStyle w:val="TableTitle"/>
+      </w:pPr>
+      <w:r>
+        <w:t>TABLE I</w:t>
+      </w:r>
+    </w:p>
+    <w:p>
+      <w:pPr>
+        <w:pStyle w:val="TableTitle"/>
+      </w:pPr>
+      <w:r>
+        <w:t>Mapping of Structural Gaps to Contributions</w:t>
+      </w:r>
+    </w:p>
+    <w:tbl>
+      <w:tblPr>
+        <w:tblW w:w="4248" w:type="dxa"/>
+        <w:jc w:val="center"/>
+        <w:tblBorders>
+          <w:top w:val="single" w:sz="4" w:space="0" w:color="000000"/>
+          <w:left w:val="single" w:sz="4" w:space="0" w:color="000000"/>
+          <w:bottom w:val="single" w:sz="4" w:space="0" w:color="000000"/>
+          <w:right w:val="single" w:sz="4" w:space="0" w:color="000000"/>
+          <w:insideH w:val="single" w:sz="4" w:space="0" w:color="000000"/>
+          <w:insideV w:val="single" w:sz="4" w:space="0" w:color="000000"/>
+        </w:tblBorders>
+        <w:tblLayout w:type="fixed"/>
+        <w:tblCellMar>
+          <w:left w:w="28" w:type="dxa"/>
+          <w:right w:w="28" w:type="dxa"/>
+        </w:tblCellMar>
+        <w:tblLook w:val="04A0" w:firstRow="1" w:lastRow="0" w:firstColumn="1" w:lastColumn="0" w:noHBand="0" w:noVBand="1"/>
+      </w:tblPr>
+      <w:tblGrid>
+        <w:gridCol w:w="1656"/>
+        <w:gridCol w:w="2592"/>
+      </w:tblGrid>
+      <w:tr>
+        <w:trPr>
+          <w:jc w:val="center"/>
+        </w:trPr>
+        <w:tc>
+          <w:tcPr>
+            <w:tcW w:w="1656" w:type="dxa"/>
+          </w:tcPr>
+          <w:p>
+            <w:pPr>
+              <w:jc w:val="center"/>
+              <w:rPr>
+                <w:sz w:val="16"/>
+                <w:szCs w:val="22"/>
+              </w:rPr>
+            </w:pPr>
+            <w:r>
+              <w:rPr>
+                <w:b/>
+                <w:sz w:val="16"/>
+                <w:szCs w:val="22"/>
+              </w:rPr>
+              <w:t>Gap</w:t>
+            </w:r>
+          </w:p>
+        </w:tc>
+        <w:tc>
+          <w:tcPr>
+            <w:tcW w:w="2592" w:type="dxa"/>
+          </w:tcPr>
+          <w:p>
+            <w:pPr>
+              <w:jc w:val="center"/>
+              <w:rPr>
+                <w:sz w:val="16"/>
+                <w:szCs w:val="22"/>
+              </w:rPr>
+            </w:pPr>
+            <w:r>
+              <w:rPr>
+                <w:b/>
+                <w:sz w:val="16"/>
+                <w:szCs w:val="22"/>
+              </w:rPr>
+              <w:t>Contribution</w:t>
+            </w:r>
+          </w:p>
+        </w:tc>
+      </w:tr>
+      <w:tr>
+        <w:trPr>
+          <w:jc w:val="center"/>
+        </w:trPr>
+        <w:tc>
+          <w:tcPr>
+            <w:tcW w:w="1656" w:type="dxa"/>
+          </w:tcPr>
+          <w:p>
+            <w:pPr>
+              <w:rPr>
+                <w:sz w:val="16"/>
+                <w:szCs w:val="22"/>
+              </w:rPr>
+            </w:pPr>
+            <w:r>
+              <w:rPr>
+                <w:sz w:val="16"/>
+                <w:szCs w:val="22"/>
+              </w:rPr>
+              <w:t>G1 Closed decision spaces</w:t>
+            </w:r>
+          </w:p>
+        </w:tc>
+        <w:tc>
+          <w:tcPr>
+            <w:tcW w:w="2592" w:type="dxa"/>
+          </w:tcPr>
+          <w:p>
+            <w:pPr>
+              <w:rPr>
+                <w:sz w:val="16"/>
+                <w:szCs w:val="22"/>
+              </w:rPr>
+            </w:pPr>
+            <w:r>
+              <w:rPr>
+                <w:sz w:val="16"/>
+                <w:szCs w:val="22"/>
+              </w:rPr>
+              <w:t>C1 Concept-based abstraction (open decision space)</w:t>
+            </w:r>
+          </w:p>
+        </w:tc>
+      </w:tr>
+      <w:tr>
+        <w:trPr>
+          <w:jc w:val="center"/>
+        </w:trPr>
+        <w:tc>
+          <w:tcPr>
+            <w:tcW w:w="1656" w:type="dxa"/>
+          </w:tcPr>
+          <w:p>
+            <w:pPr>
+              <w:rPr>
+                <w:sz w:val="16"/>
+                <w:szCs w:val="22"/>
+              </w:rPr>
+            </w:pPr>
+            <w:r>
+              <w:rPr>
+                <w:sz w:val="16"/>
+                <w:szCs w:val="22"/>
+              </w:rPr>
+              <w:t>G2 Centralized architecture</w:t>
+            </w:r>
+          </w:p>
+        </w:tc>
+        <w:tc>
+          <w:tcPr>
+            <w:tcW w:w="2592" w:type="dxa"/>
+          </w:tcPr>
+          <w:p>
+            <w:pPr>
+              <w:rPr>
+                <w:sz w:val="16"/>
+                <w:szCs w:val="22"/>
+              </w:rPr>
+            </w:pPr>
+            <w:r>
+              <w:rPr>
+                <w:sz w:val="16"/>
+                <w:szCs w:val="22"/>
+              </w:rPr>
+              <w:t>C2 Distributed inference, non-inferential coordinator</w:t>
+            </w:r>
+          </w:p>
+        </w:tc>
+      </w:tr>
+      <w:tr>
+        <w:trPr>
+          <w:jc w:val="center"/>
+        </w:trPr>
+        <w:tc>
+          <w:tcPr>
+            <w:tcW w:w="1656" w:type="dxa"/>
+          </w:tcPr>
+          <w:p>
+            <w:pPr>
+              <w:rPr>
+                <w:sz w:val="16"/>
+                <w:szCs w:val="22"/>
+              </w:rPr>
+            </w:pPr>
+            <w:r>
+              <w:rPr>
+                <w:sz w:val="16"/>
+                <w:szCs w:val="22"/>
+              </w:rPr>
+              <w:t>G3 No non-probabilistic uncertainty</w:t>
+            </w:r>
+          </w:p>
+        </w:tc>
+        <w:tc>
+          <w:tcPr>
+            <w:tcW w:w="2592" w:type="dxa"/>
+          </w:tcPr>
+          <w:p>
+            <w:pPr>
+              <w:rPr>
+                <w:sz w:val="16"/>
+                <w:szCs w:val="22"/>
+              </w:rPr>
+            </w:pPr>
+            <w:r>
+              <w:rPr>
+                <w:sz w:val="16"/>
+                <w:szCs w:val="22"/>
+              </w:rPr>
+              <w:t>C3 Confidence-gated concept modulation</w:t>
+            </w:r>
+          </w:p>
+        </w:tc>
+      </w:tr>
+      <w:tr>
+        <w:trPr>
+          <w:jc w:val="center"/>
+        </w:trPr>
+        <w:tc>
+          <w:tcPr>
+            <w:tcW w:w="1656" w:type="dxa"/>
+          </w:tcPr>
+          <w:p>
+            <w:pPr>
+              <w:rPr>
+                <w:sz w:val="16"/>
+                <w:szCs w:val="22"/>
+              </w:rPr>
+            </w:pPr>
+            <w:r>
+              <w:rPr>
+                <w:sz w:val="16"/>
+                <w:szCs w:val="22"/>
+              </w:rPr>
+              <w:t>G4 Limited traceability</w:t>
+            </w:r>
+          </w:p>
+        </w:tc>
+        <w:tc>
+          <w:tcPr>
+            <w:tcW w:w="2592" w:type="dxa"/>
+          </w:tcPr>
+          <w:p>
+            <w:pPr>
+              <w:rPr>
+                <w:sz w:val="16"/>
+                <w:szCs w:val="22"/>
+              </w:rPr>
+            </w:pPr>
+            <w:r>
+              <w:rPr>
+                <w:sz w:val="16"/>
+                <w:szCs w:val="22"/>
+              </w:rPr>
+              <w:t>C4 Intrinsic rule-level traceability</w:t>
+            </w:r>
+          </w:p>
+        </w:tc>
+      </w:tr>
+      <w:tr>
+        <w:trPr>
+          <w:jc w:val="center"/>
+        </w:trPr>
+        <w:tc>
+          <w:tcPr>
+            <w:tcW w:w="1656" w:type="dxa"/>
+          </w:tcPr>
+          <w:p>
+            <w:pPr>
+              <w:rPr>
+                <w:sz w:val="16"/>
+                <w:szCs w:val="22"/>
+              </w:rPr>
+            </w:pPr>
+            <w:r>
+              <w:rPr>
+                <w:sz w:val="16"/>
+                <w:szCs w:val="22"/>
+              </w:rPr>
+              <w:t>G5 Tight simulation-decision coupling</w:t>
+            </w:r>
+          </w:p>
+        </w:tc>
+        <w:tc>
+          <w:tcPr>
+            <w:tcW w:w="2592" w:type="dxa"/>
+          </w:tcPr>
+          <w:p>
+            <w:pPr>
+              <w:rPr>
+                <w:sz w:val="16"/>
+                <w:szCs w:val="22"/>
+              </w:rPr>
+            </w:pPr>
+            <w:r>
+              <w:rPr>
+                <w:sz w:val="16"/>
+                <w:szCs w:val="22"/>
+              </w:rPr>
+              <w:t>C5 Analytically separated cores</w:t>
+            </w:r>
+          </w:p>
+        </w:tc>
+      </w:tr>
+      <w:tr>
+        <w:trPr>
+          <w:jc w:val="center"/>
+        </w:trPr>
+        <w:tc>
+          <w:tcPr>
+            <w:tcW w:w="1656" w:type="dxa"/>
+          </w:tcPr>
+          <w:p>
+            <w:pPr>
+              <w:rPr>
+                <w:sz w:val="16"/>
+                <w:szCs w:val="22"/>
+              </w:rPr>
+            </w:pPr>
+            <w:r>
+              <w:rPr>
+                <w:sz w:val="16"/>
+                <w:szCs w:val="22"/>
+              </w:rPr>
+              <w:t>G6 Constraints under partial observability</w:t>
+            </w:r>
+          </w:p>
+        </w:tc>
+        <w:tc>
+          <w:tcPr>
+            <w:tcW w:w="2592" w:type="dxa"/>
+          </w:tcPr>
+          <w:p>
+            <w:pPr>
+              <w:rPr>
+                <w:sz w:val="16"/>
+                <w:szCs w:val="22"/>
+              </w:rPr>
+            </w:pPr>
+            <w:r>
+              <w:rPr>
+                <w:sz w:val="16"/>
+                <w:szCs w:val="22"/>
+              </w:rPr>
+              <w:t>C6 Satisficing acceptance + graduated fail-safe</w:t>
+            </w:r>
+          </w:p>
+        </w:tc>
+      </w:tr>
+    </w:tbl>
+    <w:p>
+      <w:pPr>
+        <w:pStyle w:val="PARAIndent"/>
+      </w:pPr>
+      <w:r>
+        <w:t>Taken together, these contributions turn wildfire decision support from a predefined and centralized toolkit into an open, distributed, and uncertainty-aware reasoning system whose key properties are established analytically rather than assumed. A further benefit of the concept-based organization is a substantial reduction in rule-</w:t>
+      </w:r>
+      <w:proofErr w:type="gramStart"/>
+      <w:r>
+        <w:t>base</w:t>
+      </w:r>
+      <w:proofErr w:type="gramEnd"/>
+      <w:r>
+        <w:t xml:space="preserve"> size, which keeps the system scalable as more intervention types are added.</w:t>
+      </w:r>
+    </w:p>
+    <w:p>
+      <w:pPr>
+        <w:pStyle w:val="PARAIndent"/>
+      </w:pPr>
+      <w:r>
+        <w:t xml:space="preserve">The remainder of the article is organized as follows. Section II reviews related work. Section III formulates the wildfire decision problem under partial observability. Section IV gives an overview of the framework. Section V presents the concept-based fuzzy reasoning core. Section VI describes the distributed inference and global coordination. Section VII covers uncertainty-aware modulation and traceability. Section VIII reports </w:t>
+      </w:r>
+      <w:r>
+        <w:t>experimental</w:t>
+      </w:r>
+      <w:r>
+        <w:t xml:space="preserve"> evaluation, and Section IX concludes.</w:t>
+      </w:r>
     </w:p>
     <w:p>
       <w:pPr>
@@ -540,9 +1323,6 @@
       </w:r>
     </w:p>
     <w:p>
-      <w:pPr/>
-    </w:p>
-    <w:p>
       <w:pPr>
         <w:pStyle w:val="Heading2"/>
       </w:pPr>
@@ -551,9 +1331,6 @@
       </w:r>
     </w:p>
     <w:p>
-      <w:pPr/>
-    </w:p>
-    <w:p>
       <w:pPr>
         <w:pStyle w:val="Heading2"/>
       </w:pPr>
@@ -562,9 +1339,6 @@
       </w:r>
     </w:p>
     <w:p>
-      <w:pPr/>
-    </w:p>
-    <w:p>
       <w:pPr>
         <w:pStyle w:val="Heading1"/>
       </w:pPr>
@@ -581,9 +1355,6 @@
       </w:r>
     </w:p>
     <w:p>
-      <w:pPr/>
-    </w:p>
-    <w:p>
       <w:pPr>
         <w:pStyle w:val="Heading2"/>
       </w:pPr>
@@ -592,9 +1363,6 @@
       </w:r>
     </w:p>
     <w:p>
-      <w:pPr/>
-    </w:p>
-    <w:p>
       <w:pPr>
         <w:pStyle w:val="Heading1"/>
       </w:pPr>
@@ -611,9 +1379,6 @@
       </w:r>
     </w:p>
     <w:p>
-      <w:pPr/>
-    </w:p>
-    <w:p>
       <w:pPr>
         <w:pStyle w:val="Heading2"/>
       </w:pPr>
@@ -622,9 +1387,6 @@
       </w:r>
     </w:p>
     <w:p>
-      <w:pPr/>
-    </w:p>
-    <w:p>
       <w:pPr>
         <w:pStyle w:val="Heading1"/>
       </w:pPr>
@@ -641,9 +1403,6 @@
       </w:r>
     </w:p>
     <w:p>
-      <w:pPr/>
-    </w:p>
-    <w:p>
       <w:pPr>
         <w:pStyle w:val="Heading2"/>
       </w:pPr>
@@ -652,9 +1411,6 @@
       </w:r>
     </w:p>
     <w:p>
-      <w:pPr/>
-    </w:p>
-    <w:p>
       <w:pPr>
         <w:pStyle w:val="Heading2"/>
       </w:pPr>
@@ -663,9 +1419,6 @@
       </w:r>
     </w:p>
     <w:p>
-      <w:pPr/>
-    </w:p>
-    <w:p>
       <w:pPr>
         <w:pStyle w:val="Heading2"/>
       </w:pPr>
@@ -674,9 +1427,6 @@
       </w:r>
     </w:p>
     <w:p>
-      <w:pPr/>
-    </w:p>
-    <w:p>
       <w:pPr>
         <w:pStyle w:val="Heading1"/>
       </w:pPr>
@@ -693,9 +1443,6 @@
       </w:r>
     </w:p>
     <w:p>
-      <w:pPr/>
-    </w:p>
-    <w:p>
       <w:pPr>
         <w:pStyle w:val="Heading2"/>
       </w:pPr>
@@ -704,9 +1451,6 @@
       </w:r>
     </w:p>
     <w:p>
-      <w:pPr/>
-    </w:p>
-    <w:p>
       <w:pPr>
         <w:pStyle w:val="Heading2"/>
       </w:pPr>
@@ -715,14 +1459,11 @@
       </w:r>
     </w:p>
     <w:p>
-      <w:pPr/>
-    </w:p>
-    <w:p>
       <w:pPr>
         <w:pStyle w:val="Heading1"/>
       </w:pPr>
       <w:r>
-        <w:t>VII. Uncertainty-Aware Modulation and Explainability</w:t>
+        <w:t>VII. Uncertainty-Aware Modulation and Traceability</w:t>
       </w:r>
     </w:p>
     <w:p>
@@ -734,18 +1475,12 @@
       </w:r>
     </w:p>
     <w:p>
-      <w:pPr/>
-    </w:p>
-    <w:p>
       <w:pPr>
         <w:pStyle w:val="Heading2"/>
       </w:pPr>
       <w:r>
-        <w:t>B. Explainability and AI Governance Layer</w:t>
-      </w:r>
-    </w:p>
-    <w:p>
-      <w:pPr/>
+        <w:t>B. Traceability and Governance Layer</w:t>
+      </w:r>
     </w:p>
     <w:p>
       <w:pPr>
@@ -764,9 +1499,6 @@
       </w:r>
     </w:p>
     <w:p>
-      <w:pPr/>
-    </w:p>
-    <w:p>
       <w:pPr>
         <w:pStyle w:val="Heading2"/>
       </w:pPr>
@@ -775,9 +1507,6 @@
       </w:r>
     </w:p>
     <w:p>
-      <w:pPr/>
-    </w:p>
-    <w:p>
       <w:pPr>
         <w:pStyle w:val="Heading2"/>
       </w:pPr>
@@ -786,9 +1515,6 @@
       </w:r>
     </w:p>
     <w:p>
-      <w:pPr/>
-    </w:p>
-    <w:p>
       <w:pPr>
         <w:pStyle w:val="Heading1"/>
       </w:pPr>
@@ -797,9 +1523,6 @@
       </w:r>
     </w:p>
     <w:p>
-      <w:pPr/>
-    </w:p>
-    <w:p>
       <w:pPr>
         <w:pStyle w:val="Heading1"/>
       </w:pPr>
@@ -807,9 +1530,7 @@
         <w:t>Acknowledgment</w:t>
       </w:r>
     </w:p>
-    <w:p>
-      <w:pPr/>
-    </w:p>
+    <w:p/>
     <w:p>
       <w:pPr>
         <w:pStyle w:val="Heading1"/>
@@ -819,19 +1540,301 @@
       </w:r>
     </w:p>
     <w:p>
-      <w:pPr/>
-    </w:p>
-    <w:p>
-      <w:pPr/>
-    </w:p>
-    <w:p>
-      <w:pPr/>
-      <w:r>
-        <w:br w:type="column"/>
-      </w:r>
-      <w:r>
+      <w:pPr>
+        <w:pStyle w:val="References"/>
+        <w:numPr>
+          <w:ilvl w:val="0"/>
+          <w:numId w:val="0"/>
+        </w:numPr>
+      </w:pPr>
+      <w:r>
+        <w:fldChar w:fldCharType="begin"/>
+      </w:r>
+      <w:r>
+        <w:instrText xml:space="preserve"> BIBLIOGRAPHY \l 1033 </w:instrText>
+      </w:r>
+      <w:r>
+        <w:fldChar w:fldCharType="separate"/>
+      </w:r>
+      <w:r>
+        <w:t xml:space="preserve">[1] W. M. Jolly et al., "Climate-induced variations in global wildfire danger from 1979 to 2013," Nature Communications, vol. 6, art. 7537, 2015.</w:t>
+      </w:r>
+    </w:p>
+    <w:p>
+      <w:pPr>
+        <w:pStyle w:val="References"/>
+        <w:numPr>
+          <w:ilvl w:val="0"/>
+          <w:numId w:val="0"/>
+        </w:numPr>
+      </w:pPr>
+      <w:r>
+        <w:t xml:space="preserve">[2] J. P. Shim et al., "Past, present, and future of decision support technology," Decision Support Systems, vol. 33, no. 2, pp. 111-126, 2002.</w:t>
+      </w:r>
+    </w:p>
+    <w:p>
+      <w:pPr>
+        <w:pStyle w:val="References"/>
+        <w:numPr>
+          <w:ilvl w:val="0"/>
+          <w:numId w:val="0"/>
+        </w:numPr>
+      </w:pPr>
+      <w:r>
+        <w:t xml:space="preserve">[3] EM-DAT, The International Disaster Database, Centre for Research on the Epidemiology of Disasters (CRED), UCLouvain, Brussels, Belgium. [Online]. Available: https://www.emdat.be</w:t>
+      </w:r>
+    </w:p>
+    <w:p>
+      <w:pPr>
+        <w:pStyle w:val="References"/>
+        <w:numPr>
+          <w:ilvl w:val="0"/>
+          <w:numId w:val="0"/>
+        </w:numPr>
+      </w:pPr>
+      <w:r>
+        <w:t xml:space="preserve">[4] E. K. Noonan-Wright et al., "Developing the U.S. Wildland Fire Decision Support System," Journal of Combustion, vol. 2011, art. 168473, 2011.</w:t>
+      </w:r>
+    </w:p>
+    <w:p>
+      <w:pPr>
+        <w:pStyle w:val="References"/>
+        <w:numPr>
+          <w:ilvl w:val="0"/>
+          <w:numId w:val="0"/>
+        </w:numPr>
+      </w:pPr>
+      <w:r>
+        <w:t xml:space="preserve">[5] M. A. Finney, "An overview of FlamMap fire modeling capabilities," in Fuels Management-How to Measure Success, USDA Forest Service Proc. RMRS-P-41, 2006, pp. 213-220.</w:t>
+      </w:r>
+    </w:p>
+    <w:p>
+      <w:pPr>
+        <w:pStyle w:val="References"/>
+        <w:numPr>
+          <w:ilvl w:val="0"/>
+          <w:numId w:val="0"/>
+        </w:numPr>
+      </w:pPr>
+      <w:r>
+        <w:t xml:space="preserve">[6] R. C. Rothermel, "A mathematical model for predicting fire spread in wildland fuels," USDA Forest Service, Res. Paper INT-115, 1972.</w:t>
+      </w:r>
+    </w:p>
+    <w:p>
+      <w:pPr>
+        <w:pStyle w:val="References"/>
+        <w:numPr>
+          <w:ilvl w:val="0"/>
+          <w:numId w:val="0"/>
+        </w:numPr>
+      </w:pPr>
+      <w:r>
+        <w:t xml:space="preserve">[7] S. Zhou and A. Erdogan, "A spatial optimization model for resource allocation for wildfire suppression and resident evacuation," Computers &amp; Industrial Engineering, vol. 138, art. 106101, 2019.</w:t>
+      </w:r>
+    </w:p>
+    <w:p>
+      <w:pPr>
+        <w:pStyle w:val="References"/>
+        <w:numPr>
+          <w:ilvl w:val="0"/>
+          <w:numId w:val="0"/>
+        </w:numPr>
+      </w:pPr>
+      <w:r>
+        <w:t xml:space="preserve">[8] E. Triantaphyllou, Multi-Criteria Decision Making Methods: A Comparative Study. Dordrecht, The Netherlands: Kluwer, 2000.</w:t>
+      </w:r>
+    </w:p>
+    <w:p>
+      <w:pPr>
+        <w:pStyle w:val="References"/>
+        <w:numPr>
+          <w:ilvl w:val="0"/>
+          <w:numId w:val="0"/>
+        </w:numPr>
+      </w:pPr>
+      <w:r>
+        <w:t xml:space="preserve">[9] F. Huot et al., "Next day wildfire spread: A machine learning dataset to predict wildfire spreading from remote-sensing data," IEEE Trans. Geosci. Remote Sens., vol. 60, pp. 1-13, 2022.</w:t>
+      </w:r>
+    </w:p>
+    <w:p>
+      <w:pPr>
+        <w:pStyle w:val="References"/>
+        <w:numPr>
+          <w:ilvl w:val="0"/>
+          <w:numId w:val="0"/>
+        </w:numPr>
+      </w:pPr>
+      <w:r>
+        <w:t xml:space="preserve">[10] P. Dubey and P. Dubey, "Bridging spatiotemporal wildfire prediction and decision modeling using transformer networks and fuzzy inference systems," MethodsX, vol. 15, art. 103498, 2025.</w:t>
+      </w:r>
+    </w:p>
+    <w:p>
+      <w:pPr>
+        <w:pStyle w:val="References"/>
+        <w:numPr>
+          <w:ilvl w:val="0"/>
+          <w:numId w:val="0"/>
+        </w:numPr>
+      </w:pPr>
+      <w:r>
+        <w:t xml:space="preserve">[11] T. Orphanoudakis, C. Betzelos, and H. C. Leligou, "MORA: A multicriteria optimal resource allocation and decision support toolkit for wildfire management," Algorithms, vol. 18, no. 11, art. 677, 2025.</w:t>
+      </w:r>
+    </w:p>
+    <w:p>
+      <w:pPr>
+        <w:pStyle w:val="References"/>
+        <w:numPr>
+          <w:ilvl w:val="0"/>
+          <w:numId w:val="0"/>
+        </w:numPr>
+      </w:pPr>
+      <w:r>
+        <w:t xml:space="preserve">[12] M. Lourenco, L. B. Oliveira, J. P. Oliveira, A. Mora, H. Oliveira, and R. Santos, "An integrated decision support system for improving wildfire suppression management," ISPRS Int. J. Geo-Information, vol. 10, no. 8, art. 497, 2021.</w:t>
+      </w:r>
+    </w:p>
+    <w:p>
+      <w:pPr>
+        <w:pStyle w:val="References"/>
+        <w:numPr>
+          <w:ilvl w:val="0"/>
+          <w:numId w:val="0"/>
+        </w:numPr>
+      </w:pPr>
+      <w:r>
+        <w:t xml:space="preserve">[13] M. P. Thompson and D. E. Calkin, "Uncertainty and risk in wildland fire management: A review," Journal of Environmental Management, vol. 92, no. 8, pp. 1895-1909, 2011.</w:t>
+      </w:r>
+    </w:p>
+    <w:p>
+      <w:pPr>
+        <w:pStyle w:val="References"/>
+        <w:numPr>
+          <w:ilvl w:val="0"/>
+          <w:numId w:val="0"/>
+        </w:numPr>
+      </w:pPr>
+      <w:r>
+        <w:t xml:space="preserve">[14] S. M. Lundberg and S.-I. Lee, "A unified approach to interpreting model predictions," in Proc. NeurIPS, 2017, pp. 4765-4774.</w:t>
+      </w:r>
+    </w:p>
+    <w:p>
+      <w:pPr>
+        <w:pStyle w:val="References"/>
+        <w:numPr>
+          <w:ilvl w:val="0"/>
+          <w:numId w:val="0"/>
+        </w:numPr>
+      </w:pPr>
+      <w:r>
+        <w:t xml:space="preserve">[15] M. T. Ribeiro, S. Singh, and C. Guestrin, "Why should I trust you?: Explaining the predictions of any classifier," in Proc. ACM SIGKDD, 2016, pp. 1135-1144.</w:t>
+      </w:r>
+    </w:p>
+    <w:p>
+      <w:pPr>
+        <w:pStyle w:val="References"/>
+        <w:numPr>
+          <w:ilvl w:val="0"/>
+          <w:numId w:val="0"/>
+        </w:numPr>
+      </w:pPr>
+      <w:r>
+        <w:t xml:space="preserve">[16] L. P. Kaelbling, M. L. Littman, and A. R. Cassandra, "Planning and acting in partially observable stochastic domains," Artificial Intelligence, vol. 101, no. 1-2, pp. 99-134, 1998.</w:t>
+      </w:r>
+    </w:p>
+    <w:p>
+      <w:pPr>
+        <w:pStyle w:val="References"/>
+        <w:numPr>
+          <w:ilvl w:val="0"/>
+          <w:numId w:val="0"/>
+        </w:numPr>
+      </w:pPr>
+      <w:r>
+        <w:t xml:space="preserve">[17] G. Shafer, A Mathematical Theory of Evidence. Princeton, NJ, USA: Princeton Univ. Press, 1976.</w:t>
+      </w:r>
+    </w:p>
+    <w:p>
+      <w:pPr>
+        <w:pStyle w:val="References"/>
+        <w:numPr>
+          <w:ilvl w:val="0"/>
+          <w:numId w:val="0"/>
+        </w:numPr>
+      </w:pPr>
+      <w:r>
+        <w:t xml:space="preserve">[18] L. A. Zadeh, "Fuzzy sets," Information and Control, vol. 8, no. 3, pp. 338-353, 1965.</w:t>
+      </w:r>
+    </w:p>
+    <w:p>
+      <w:pPr>
+        <w:pStyle w:val="References"/>
+        <w:numPr>
+          <w:ilvl w:val="0"/>
+          <w:numId w:val="0"/>
+        </w:numPr>
+      </w:pPr>
+      <w:r>
+        <w:t xml:space="preserve">[19] E. H. Mamdani and S. Assilian, "An experiment in linguistic synthesis with a fuzzy logic controller," Int. J. Man-Machine Studies, vol. 7, no. 1, pp. 1-13, 1975.</w:t>
+      </w:r>
+    </w:p>
+    <w:p>
+      <w:pPr>
+        <w:pStyle w:val="References"/>
+        <w:numPr>
+          <w:ilvl w:val="0"/>
+          <w:numId w:val="0"/>
+        </w:numPr>
+      </w:pPr>
+      <w:r>
+        <w:t xml:space="preserve">[20] T. Tsataltzinos, L. Iliadis, and S. Spartalis, "An intelligent fuzzy inference system for risk estimation: The case of forest fires in Greece," in Proc. IFIP AIAI, 2009, pp. 303-310.</w:t>
+      </w:r>
+    </w:p>
+    <w:p>
+      <w:pPr>
+        <w:pStyle w:val="References"/>
+        <w:numPr>
+          <w:ilvl w:val="0"/>
+          <w:numId w:val="0"/>
+        </w:numPr>
+      </w:pPr>
+      <w:r>
+        <w:t xml:space="preserve">[21] M. Wooldridge, An Introduction to MultiAgent Systems, 2nd ed. Chichester, U.K.: Wiley, 2009.</w:t>
+      </w:r>
+    </w:p>
+    <w:p>
+      <w:pPr>
+        <w:pStyle w:val="References"/>
+        <w:numPr>
+          <w:ilvl w:val="0"/>
+          <w:numId w:val="0"/>
+        </w:numPr>
+      </w:pPr>
+      <w:r>
+        <w:t xml:space="preserve">[22] G. V. S. Raju, J. Zhou, and R. A. Kisner, "Hierarchical fuzzy control," Int. J. Control, vol. 54, no. 5, pp. 1201-1216, 1991.</w:t>
+      </w:r>
+    </w:p>
+    <w:p>
+      <w:pPr>
+        <w:pStyle w:val="References"/>
+        <w:numPr>
+          <w:ilvl w:val="0"/>
+          <w:numId w:val="0"/>
+        </w:numPr>
+      </w:pPr>
+      <w:r>
+        <w:t xml:space="preserve">[23] H. A. Simon, "Rational choice and the structure of the environment," Psychological Review, vol. 63, no. 2, pp. 129-138, 1956.</w:t>
+      </w:r>
+      <w:r>
+        <w:fldChar w:fldCharType="end"/>
+      </w:r>
+    </w:p>
+    <w:p/>
+    <w:p>
+      <w:r>
+        <w:rPr>
+          <w:noProof/>
+        </w:rPr>
         <w:drawing>
-          <wp:anchor distT="0" distB="0" distL="114300" distR="114300" simplePos="0" relativeHeight="251658240" behindDoc="0" locked="0" layoutInCell="1" allowOverlap="1">
+          <wp:anchor distT="0" distB="0" distL="114300" distR="114300" simplePos="0" relativeHeight="251656704" behindDoc="0" locked="0" layoutInCell="1" allowOverlap="1" wp14:anchorId="1535A905" wp14:editId="46A1D392">
             <wp:simplePos x="0" y="0"/>
             <wp:positionH relativeFrom="column">
               <wp:align>left</wp:align>
@@ -840,18 +1843,19 @@
               <wp:posOffset>0</wp:posOffset>
             </wp:positionV>
             <wp:extent cx="731520" cy="915840"/>
+            <wp:effectExtent l="0" t="0" r="0" b="0"/>
             <wp:wrapSquare wrapText="bothSides"/>
             <wp:docPr id="1" name="Picture 1"/>
             <wp:cNvGraphicFramePr/>
-            <a:graphic xmlns:a="http://schemas.openxmlformats.org/drawingml/2006/main" xmlns:pic="http://schemas.openxmlformats.org/drawingml/2006/picture">
+            <a:graphic xmlns:a="http://schemas.openxmlformats.org/drawingml/2006/main">
               <a:graphicData uri="http://schemas.openxmlformats.org/drawingml/2006/picture">
-                <pic:pic>
+                <pic:pic xmlns:pic="http://schemas.openxmlformats.org/drawingml/2006/picture">
                   <pic:nvPicPr>
                     <pic:cNvPr id="0" name="caglar_bio.png"/>
                     <pic:cNvPicPr/>
                   </pic:nvPicPr>
                   <pic:blipFill>
-                    <a:blip r:embed="rId33"/>
+                    <a:blip r:embed="rId10"/>
                     <a:stretch>
                       <a:fillRect/>
                     </a:stretch>
@@ -861,7 +1865,9 @@
                       <a:off x="0" y="0"/>
                       <a:ext cx="731520" cy="915840"/>
                     </a:xfrm>
-                    <a:prstGeom prst="rect"/>
+                    <a:prstGeom prst="rect">
+                      <a:avLst/>
+                    </a:prstGeom>
                   </pic:spPr>
                 </pic:pic>
               </a:graphicData>
@@ -880,13 +1886,12 @@
       </w:r>
     </w:p>
     <w:p>
-      <w:pPr/>
-      <w:r>
-        <w:br w:type="column"/>
-      </w:r>
-      <w:r>
+      <w:r>
+        <w:rPr>
+          <w:noProof/>
+        </w:rPr>
         <w:drawing>
-          <wp:anchor distT="0" distB="0" distL="114300" distR="114300" simplePos="0" relativeHeight="251658240" behindDoc="0" locked="0" layoutInCell="1" allowOverlap="1">
+          <wp:anchor distT="0" distB="0" distL="114300" distR="114300" simplePos="0" relativeHeight="251658752" behindDoc="0" locked="0" layoutInCell="1" allowOverlap="1" wp14:anchorId="493E6F11" wp14:editId="7B37AFA5">
             <wp:simplePos x="0" y="0"/>
             <wp:positionH relativeFrom="column">
               <wp:align>left</wp:align>
@@ -895,18 +1900,19 @@
               <wp:posOffset>0</wp:posOffset>
             </wp:positionV>
             <wp:extent cx="731520" cy="894080"/>
+            <wp:effectExtent l="0" t="0" r="0" b="0"/>
             <wp:wrapSquare wrapText="bothSides"/>
             <wp:docPr id="2" name="Picture 2"/>
             <wp:cNvGraphicFramePr/>
-            <a:graphic xmlns:a="http://schemas.openxmlformats.org/drawingml/2006/main" xmlns:pic="http://schemas.openxmlformats.org/drawingml/2006/picture">
+            <a:graphic xmlns:a="http://schemas.openxmlformats.org/drawingml/2006/main">
               <a:graphicData uri="http://schemas.openxmlformats.org/drawingml/2006/picture">
-                <pic:pic>
+                <pic:pic xmlns:pic="http://schemas.openxmlformats.org/drawingml/2006/picture">
                   <pic:nvPicPr>
                     <pic:cNvPr id="0" name="kleb.jpg"/>
                     <pic:cNvPicPr/>
                   </pic:nvPicPr>
                   <pic:blipFill>
-                    <a:blip r:embed="rId34"/>
+                    <a:blip r:embed="rId11"/>
                     <a:stretch>
                       <a:fillRect/>
                     </a:stretch>
@@ -916,7 +1922,9 @@
                       <a:off x="0" y="0"/>
                       <a:ext cx="731520" cy="894080"/>
                     </a:xfrm>
-                    <a:prstGeom prst="rect"/>
+                    <a:prstGeom prst="rect">
+                      <a:avLst/>
+                    </a:prstGeom>
                   </pic:spPr>
                 </pic:pic>
               </a:graphicData>
@@ -935,16 +1943,45 @@
       </w:r>
     </w:p>
     <w:p>
-      <w:pPr/>
       <w:r>
         <w:t>He has been a full professor in the Department of Electrical and Electronics Engineering of METU since 1999. He has a background in optimization, optimal control theory, computer vision, intelligent systems, flight control, walking robots, and unmanned vehicles.</w:t>
       </w:r>
     </w:p>
     <w:p>
-      <w:pPr/>
-      <w:r>
-        <w:t>Dr. Leblebicioğlu has been a member of numerous international program committees and has been (co-) author of more than 40 journal papers, book chapters, and numerous conference papers. He is on several IFAC technical committees. He was the editor of the journal ELEKTRIK published by TÜBİTAK (Turkish Scientific and Technical Research Council) from 1996 to 2009. He is on the editorial board of several Turkish technical journals. He organized an international workshop on computer vision and intelligent systems and two national conferences on control. He conducted several R&amp;D projects as project leader and researcher and gave consultancy to BİLTEN (TÜBİTAK’s Research Center on Electronics and Information Technologies), 3rd Supply and Maintenance Center of Turkish Air Forces (Ankara), TÜBİTAK-İltaren, and to ASELSAN on the topic of “real time automatic visual tracking of targets.” Now he is studying unmanned vehicles, in particular, unmanned air and underwater vehicles. He completed a project (supported by TÜBİTAK) on the construction of a special unmanned under-sea vehicle, called ULISAR, which is a mixture of an ROV and a fully automated system. His current project, also supported by TÜBİTAK, is on the coordinated guidance of multiple unmanned air vehicles. Presently, he is also working as an advisor for the Bahçeşehir University Foundation, BUEV, about matters related to education, developing educational systems to help students and teachers, intelligent testing, and student evaluation systems.</w:t>
-      </w:r>
+      <w:r>
+        <w:t>Dr. Leblebicioğlu has been a member of numerous international program committees and has been (co-) author of more than 40 journal papers, book chapters, and numerous conference papers. He is on several IFAC technical committees. He was the editor of the journal ELEKTRIK published by TÜBİTAK (Turkish Scientific and Technical Research Council) from 1996 to 2009. He is on the editorial board of several Turkish technical journals. He organized an international workshop on computer vision and intelligent systems and two national conferences on control. He conducted several R&amp;D projects as project leader and researcher and gave consultancy to BİLTEN (TÜBİTAK’s Research Center on Electronics and Information Technologies), 3rd Supply and Maintenance Center of Turkish Air Forces (Ankara), TÜBİTAK-</w:t>
+      </w:r>
+      <w:proofErr w:type="spellStart"/>
+      <w:r>
+        <w:t>İltaren</w:t>
+      </w:r>
+      <w:proofErr w:type="spellEnd"/>
+      <w:r>
+        <w:t xml:space="preserve">, and to ASELSAN on the topic of “real time automatic visual tracking of targets.” Now he is studying unmanned vehicles, in particular, unmanned air and underwater vehicles. He completed a project (supported by TÜBİTAK) on the construction of a special unmanned under-sea vehicle, called ULISAR, which is a mixture of an ROV and a fully automated system. His current project, also supported by TÜBİTAK, is on the coordinated guidance of multiple unmanned air vehicles. </w:t>
+      </w:r>
+      <w:r>
+        <w:lastRenderedPageBreak/>
+        <w:t>Presently, he is also working as an advisor for the Bahçeşehir University Foundation, BUEV, about matters related to education, developing educational systems to help students and teachers, intelligent testing, and student evaluation systems.</w:t>
+      </w:r>
+    </w:p>
+    <w:p>
+      <w:pPr>
+        <w:keepNext/>
+        <w:pBdr>
+          <w:top w:val="nil"/>
+          <w:left w:val="nil"/>
+          <w:bottom w:val="nil"/>
+          <w:right w:val="nil"/>
+          <w:between w:val="nil"/>
+        </w:pBdr>
+        <w:spacing w:before="240" w:after="80"/>
+        <w:jc w:val="center"/>
+        <w:rPr>
+          <w:color w:val="222222"/>
+          <w:sz w:val="16"/>
+          <w:szCs w:val="16"/>
+        </w:rPr>
+      </w:pPr>
     </w:p>
     <w:sectPr>
       <w:footnotePr>
@@ -964,7 +2001,7 @@
 </file>
 
 <file path=word/endnotes.xml><?xml version="1.0" encoding="utf-8"?>
-<w:endnotes xmlns:wpc="http://schemas.microsoft.com/office/word/2010/wordprocessingCanvas" xmlns:cx="http://schemas.microsoft.com/office/drawing/2014/chartex" xmlns:cx1="http://schemas.microsoft.com/office/drawing/2015/9/8/chartex" xmlns:cx2="http://schemas.microsoft.com/office/drawing/2015/10/21/chartex" xmlns:cx3="http://schemas.microsoft.com/office/drawing/2016/5/9/chartex" xmlns:cx4="http://schemas.microsoft.com/office/drawing/2016/5/10/chartex" xmlns:cx5="http://schemas.microsoft.com/office/drawing/2016/5/11/chartex" xmlns:cx6="http://schemas.microsoft.com/office/drawing/2016/5/12/chartex" xmlns:cx7="http://schemas.microsoft.com/office/drawing/2016/5/13/chartex" xmlns:cx8="http://schemas.microsoft.com/office/drawing/2016/5/14/chartex" xmlns:mc="http://schemas.openxmlformats.org/markup-compatibility/2006" xmlns:aink="http://schemas.microsoft.com/office/drawing/2016/ink" xmlns:am3d="http://schemas.microsoft.com/office/drawing/2017/model3d" xmlns:o="urn:schemas-microsoft-com:office:office" xmlns:oel="http://schemas.microsoft.com/office/2019/extlst" xmlns:r="http://schemas.openxmlformats.org/officeDocument/2006/relationships" xmlns:m="http://schemas.openxmlformats.org/officeDocument/2006/math" xmlns:v="urn:schemas-microsoft-com:vml" xmlns:wp14="http://schemas.microsoft.com/office/word/2010/wordprocessingDrawing" xmlns:wp="http://schemas.openxmlformats.org/drawingml/2006/wordprocessingDrawing" xmlns:w10="urn:schemas-microsoft-com:office:word" xmlns:w="http://schemas.openxmlformats.org/wordprocessingml/2006/main" xmlns:w14="http://schemas.microsoft.com/office/word/2010/wordml" xmlns:w15="http://schemas.microsoft.com/office/word/2012/wordml" xmlns:w16cex="http://schemas.microsoft.com/office/word/2018/wordml/cex" xmlns:w16cid="http://schemas.microsoft.com/office/word/2016/wordml/cid" xmlns:w16="http://schemas.microsoft.com/office/word/2018/wordml" xmlns:w16du="http://schemas.microsoft.com/office/word/2023/wordml/word16du" xmlns:w16sdtdh="http://schemas.microsoft.com/office/word/2020/wordml/sdtdatahash" xmlns:w16se="http://schemas.microsoft.com/office/word/2015/wordml/symex" xmlns:wpg="http://schemas.microsoft.com/office/word/2010/wordprocessingGroup" xmlns:wpi="http://schemas.microsoft.com/office/word/2010/wordprocessingInk" xmlns:wne="http://schemas.microsoft.com/office/word/2006/wordml" xmlns:wps="http://schemas.microsoft.com/office/word/2010/wordprocessingShape" mc:Ignorable="w14 w15 w16se w16cid w16 w16cex w16sdtdh w16du wp14">
+<w:endnotes xmlns:wpc="http://schemas.microsoft.com/office/word/2010/wordprocessingCanvas" xmlns:cx="http://schemas.microsoft.com/office/drawing/2014/chartex" xmlns:cx1="http://schemas.microsoft.com/office/drawing/2015/9/8/chartex" xmlns:cx2="http://schemas.microsoft.com/office/drawing/2015/10/21/chartex" xmlns:cx3="http://schemas.microsoft.com/office/drawing/2016/5/9/chartex" xmlns:cx4="http://schemas.microsoft.com/office/drawing/2016/5/10/chartex" xmlns:cx5="http://schemas.microsoft.com/office/drawing/2016/5/11/chartex" xmlns:cx6="http://schemas.microsoft.com/office/drawing/2016/5/12/chartex" xmlns:cx7="http://schemas.microsoft.com/office/drawing/2016/5/13/chartex" xmlns:cx8="http://schemas.microsoft.com/office/drawing/2016/5/14/chartex" xmlns:mc="http://schemas.openxmlformats.org/markup-compatibility/2006" xmlns:aink="http://schemas.microsoft.com/office/drawing/2016/ink" xmlns:am3d="http://schemas.microsoft.com/office/drawing/2017/model3d" xmlns:o="urn:schemas-microsoft-com:office:office" xmlns:oel="http://schemas.microsoft.com/office/2019/extlst" xmlns:r="http://schemas.openxmlformats.org/officeDocument/2006/relationships" xmlns:m="http://schemas.openxmlformats.org/officeDocument/2006/math" xmlns:v="urn:schemas-microsoft-com:vml" xmlns:wp14="http://schemas.microsoft.com/office/word/2010/wordprocessingDrawing" xmlns:wp="http://schemas.openxmlformats.org/drawingml/2006/wordprocessingDrawing" xmlns:w10="urn:schemas-microsoft-com:office:word" xmlns:w="http://schemas.openxmlformats.org/wordprocessingml/2006/main" xmlns:w14="http://schemas.microsoft.com/office/word/2010/wordml" xmlns:w15="http://schemas.microsoft.com/office/word/2012/wordml" xmlns:w16cex="http://schemas.microsoft.com/office/word/2018/wordml/cex" xmlns:w16cid="http://schemas.microsoft.com/office/word/2016/wordml/cid" xmlns:w16="http://schemas.microsoft.com/office/word/2018/wordml" xmlns:w16du="http://schemas.microsoft.com/office/word/2023/wordml/word16du" xmlns:w16sdtdh="http://schemas.microsoft.com/office/word/2020/wordml/sdtdatahash" xmlns:w16sdtfl="http://schemas.microsoft.com/office/word/2024/wordml/sdtformatlock" xmlns:w16se="http://schemas.microsoft.com/office/word/2015/wordml/symex" xmlns:wpg="http://schemas.microsoft.com/office/word/2010/wordprocessingGroup" xmlns:wpi="http://schemas.microsoft.com/office/word/2010/wordprocessingInk" xmlns:wne="http://schemas.microsoft.com/office/word/2006/wordml" xmlns:wps="http://schemas.microsoft.com/office/word/2010/wordprocessingShape" mc:Ignorable="w14 w15 w16se w16cid w16 w16cex w16sdtdh w16sdtfl w16du wp14">
   <w:endnote w:type="separator" w:id="-1">
     <w:p>
       <w:r>
@@ -983,7 +2020,7 @@
 </file>
 
 <file path=word/footnotes.xml><?xml version="1.0" encoding="utf-8"?>
-<w:footnotes xmlns:wpc="http://schemas.microsoft.com/office/word/2010/wordprocessingCanvas" xmlns:cx="http://schemas.microsoft.com/office/drawing/2014/chartex" xmlns:cx1="http://schemas.microsoft.com/office/drawing/2015/9/8/chartex" xmlns:cx2="http://schemas.microsoft.com/office/drawing/2015/10/21/chartex" xmlns:cx3="http://schemas.microsoft.com/office/drawing/2016/5/9/chartex" xmlns:cx4="http://schemas.microsoft.com/office/drawing/2016/5/10/chartex" xmlns:cx5="http://schemas.microsoft.com/office/drawing/2016/5/11/chartex" xmlns:cx6="http://schemas.microsoft.com/office/drawing/2016/5/12/chartex" xmlns:cx7="http://schemas.microsoft.com/office/drawing/2016/5/13/chartex" xmlns:cx8="http://schemas.microsoft.com/office/drawing/2016/5/14/chartex" xmlns:mc="http://schemas.openxmlformats.org/markup-compatibility/2006" xmlns:aink="http://schemas.microsoft.com/office/drawing/2016/ink" xmlns:am3d="http://schemas.microsoft.com/office/drawing/2017/model3d" xmlns:o="urn:schemas-microsoft-com:office:office" xmlns:oel="http://schemas.microsoft.com/office/2019/extlst" xmlns:r="http://schemas.openxmlformats.org/officeDocument/2006/relationships" xmlns:m="http://schemas.openxmlformats.org/officeDocument/2006/math" xmlns:v="urn:schemas-microsoft-com:vml" xmlns:wp14="http://schemas.microsoft.com/office/word/2010/wordprocessingDrawing" xmlns:wp="http://schemas.openxmlformats.org/drawingml/2006/wordprocessingDrawing" xmlns:w10="urn:schemas-microsoft-com:office:word" xmlns:w="http://schemas.openxmlformats.org/wordprocessingml/2006/main" xmlns:w14="http://schemas.microsoft.com/office/word/2010/wordml" xmlns:w15="http://schemas.microsoft.com/office/word/2012/wordml" xmlns:w16cex="http://schemas.microsoft.com/office/word/2018/wordml/cex" xmlns:w16cid="http://schemas.microsoft.com/office/word/2016/wordml/cid" xmlns:w16="http://schemas.microsoft.com/office/word/2018/wordml" xmlns:w16du="http://schemas.microsoft.com/office/word/2023/wordml/word16du" xmlns:w16sdtdh="http://schemas.microsoft.com/office/word/2020/wordml/sdtdatahash" xmlns:w16se="http://schemas.microsoft.com/office/word/2015/wordml/symex" xmlns:wpg="http://schemas.microsoft.com/office/word/2010/wordprocessingGroup" xmlns:wpi="http://schemas.microsoft.com/office/word/2010/wordprocessingInk" xmlns:wne="http://schemas.microsoft.com/office/word/2006/wordml" xmlns:wps="http://schemas.microsoft.com/office/word/2010/wordprocessingShape" mc:Ignorable="w14 w15 w16se w16cid w16 w16cex w16sdtdh w16du wp14">
+<w:footnotes xmlns:wpc="http://schemas.microsoft.com/office/word/2010/wordprocessingCanvas" xmlns:cx="http://schemas.microsoft.com/office/drawing/2014/chartex" xmlns:cx1="http://schemas.microsoft.com/office/drawing/2015/9/8/chartex" xmlns:cx2="http://schemas.microsoft.com/office/drawing/2015/10/21/chartex" xmlns:cx3="http://schemas.microsoft.com/office/drawing/2016/5/9/chartex" xmlns:cx4="http://schemas.microsoft.com/office/drawing/2016/5/10/chartex" xmlns:cx5="http://schemas.microsoft.com/office/drawing/2016/5/11/chartex" xmlns:cx6="http://schemas.microsoft.com/office/drawing/2016/5/12/chartex" xmlns:cx7="http://schemas.microsoft.com/office/drawing/2016/5/13/chartex" xmlns:cx8="http://schemas.microsoft.com/office/drawing/2016/5/14/chartex" xmlns:mc="http://schemas.openxmlformats.org/markup-compatibility/2006" xmlns:aink="http://schemas.microsoft.com/office/drawing/2016/ink" xmlns:am3d="http://schemas.microsoft.com/office/drawing/2017/model3d" xmlns:o="urn:schemas-microsoft-com:office:office" xmlns:oel="http://schemas.microsoft.com/office/2019/extlst" xmlns:r="http://schemas.openxmlformats.org/officeDocument/2006/relationships" xmlns:m="http://schemas.openxmlformats.org/officeDocument/2006/math" xmlns:v="urn:schemas-microsoft-com:vml" xmlns:wp14="http://schemas.microsoft.com/office/word/2010/wordprocessingDrawing" xmlns:wp="http://schemas.openxmlformats.org/drawingml/2006/wordprocessingDrawing" xmlns:w10="urn:schemas-microsoft-com:office:word" xmlns:w="http://schemas.openxmlformats.org/wordprocessingml/2006/main" xmlns:w14="http://schemas.microsoft.com/office/word/2010/wordml" xmlns:w15="http://schemas.microsoft.com/office/word/2012/wordml" xmlns:w16cex="http://schemas.microsoft.com/office/word/2018/wordml/cex" xmlns:w16cid="http://schemas.microsoft.com/office/word/2016/wordml/cid" xmlns:w16="http://schemas.microsoft.com/office/word/2018/wordml" xmlns:w16du="http://schemas.microsoft.com/office/word/2023/wordml/word16du" xmlns:w16sdtdh="http://schemas.microsoft.com/office/word/2020/wordml/sdtdatahash" xmlns:w16sdtfl="http://schemas.microsoft.com/office/word/2024/wordml/sdtformatlock" xmlns:w16se="http://schemas.microsoft.com/office/word/2015/wordml/symex" xmlns:wpg="http://schemas.microsoft.com/office/word/2010/wordprocessingGroup" xmlns:wpi="http://schemas.microsoft.com/office/word/2010/wordprocessingInk" xmlns:wne="http://schemas.microsoft.com/office/word/2006/wordml" xmlns:wps="http://schemas.microsoft.com/office/word/2010/wordprocessingShape" mc:Ignorable="w14 w15 w16se w16cid w16 w16cex w16sdtdh w16sdtfl w16du wp14">
   <w:footnote w:type="separator" w:id="-1">
     <w:p>
       <w:pPr>
@@ -1023,14 +2060,7 @@
           <w:sz w:val="16"/>
           <w:szCs w:val="16"/>
         </w:rPr>
-        <w:t xml:space="preserve">(Corresponding author: Çağlar Akman.)</w:t>
-      </w:r>
-      <w:r>
-        <w:rPr>
-          <w:sz w:val="16"/>
-          <w:szCs w:val="16"/>
-        </w:rPr>
-        <w:t xml:space="preserve"/>
+        <w:t>Çağlar Akman and Kemal Leblebicioğlu are with the Department of Electrical and Electronics Engineering, Middle East Technical University, 06800 Ankara, Türkiye.</w:t>
       </w:r>
       <w:r>
         <w:rPr>
@@ -1038,159 +2068,20 @@
           <w:sz w:val="16"/>
           <w:szCs w:val="16"/>
         </w:rPr>
-        <w:t xml:space="preserve"/>
-      </w:r>
-      <w:r>
-        <w:rPr>
-          <w:sz w:val="16"/>
-          <w:szCs w:val="16"/>
-        </w:rPr>
-        <w:t/>
-      </w:r>
-      <w:r>
-        <w:rPr>
-          <w:color w:val="000000"/>
-          <w:sz w:val="16"/>
-          <w:szCs w:val="16"/>
-        </w:rPr>
-        <w:t xml:space="preserve"/>
-      </w:r>
-      <w:r>
-        <w:rPr>
-          <w:sz w:val="16"/>
-          <w:szCs w:val="16"/>
-        </w:rPr>
-        <w:t xml:space="preserve"/>
-      </w:r>
-      <w:r>
-        <w:rPr>
-          <w:color w:val="000000"/>
-          <w:sz w:val="16"/>
-          <w:szCs w:val="16"/>
-        </w:rPr>
-        <w:t/>
-      </w:r>
-      <w:r>
-        <w:rPr>
-          <w:sz w:val="16"/>
-          <w:szCs w:val="16"/>
-        </w:rPr>
-        <w:t/>
-      </w:r>
-      <w:r>
-        <w:rPr>
-          <w:i/>
-          <w:sz w:val="16"/>
-          <w:szCs w:val="16"/>
-        </w:rPr>
-        <w:t xml:space="preserve"/>
-      </w:r>
-      <w:r>
-        <w:rPr>
-          <w:i/>
-          <w:sz w:val="16"/>
-          <w:szCs w:val="16"/>
-        </w:rPr>
-        <w:t/>
-      </w:r>
-      <w:r>
-        <w:rPr>
-          <w:i/>
-          <w:sz w:val="16"/>
-          <w:szCs w:val="16"/>
-        </w:rPr>
-        <w:t xml:space="preserve"/>
-      </w:r>
-      <w:r>
-        <w:rPr>
-          <w:sz w:val="16"/>
-          <w:szCs w:val="16"/>
-        </w:rPr>
-        <w:t xml:space="preserve"/>
-      </w:r>
-    </w:p>
-    <w:p>
-      <w:pPr>
-        <w:keepLines/>
-        <w:pBdr>
-          <w:top w:val="nil"/>
-          <w:left w:val="nil"/>
-          <w:bottom w:val="nil"/>
-          <w:right w:val="nil"/>
-          <w:between w:val="nil"/>
-        </w:pBdr>
-        <w:ind w:firstLine="202"/>
-        <w:jc w:val="both"/>
-        <w:rPr>
-          <w:color w:val="000000"/>
-          <w:sz w:val="16"/>
-          <w:szCs w:val="16"/>
-        </w:rPr>
-      </w:pPr>
-      <w:r>
-        <w:rPr>
-          <w:color w:val="000000"/>
-          <w:sz w:val="16"/>
-          <w:szCs w:val="16"/>
-        </w:rPr>
-        <w:t>Çağlar Akman and Kemal Leblebicioğlu are with the Department of Electrical and Electronics Engineering, Middle East Technical University, 06800 Ankara, Türkiye.</w:t>
-      </w:r>
-      <w:r>
-        <w:rPr>
-          <w:sz w:val="16"/>
-          <w:szCs w:val="16"/>
-        </w:rPr>
-        <w:t/>
-      </w:r>
-      <w:r>
-        <w:rPr>
-          <w:color w:val="000000"/>
-          <w:sz w:val="16"/>
-          <w:szCs w:val="16"/>
-        </w:rPr>
-        <w:t xml:space="preserve"/>
-      </w:r>
-    </w:p>
-  </w:footnote>
-  <w:footnote w:id="2">
-    <w:p>
-      <w:pPr>
-        <w:pBdr>
-          <w:top w:val="nil"/>
-          <w:left w:val="nil"/>
-          <w:bottom w:val="nil"/>
-          <w:right w:val="nil"/>
-          <w:between w:val="nil"/>
-        </w:pBdr>
-        <w:ind w:firstLine="202"/>
-        <w:jc w:val="both"/>
-        <w:rPr>
-          <w:color w:val="000000"/>
-          <w:sz w:val="16"/>
-          <w:szCs w:val="16"/>
-        </w:rPr>
-      </w:pPr>
-      <w:r>
-        <w:rPr>
-          <w:rStyle w:val="FootnoteReference"/>
-        </w:rPr>
-        <w:footnoteRef/>
-      </w:r>
-      <w:r>
-        <w:rPr>
-          <w:color w:val="000000"/>
-          <w:sz w:val="16"/>
-          <w:szCs w:val="16"/>
-        </w:rPr>
-        <w:t>It is recommended that footnotes be avoided (except for the unnumbered footnote with the receipt date on the first page). Instead, try to integrate the footnote information into the text.</w:t>
-      </w:r>
+        <w:t xml:space="preserve"> </w:t>
+      </w:r>
+    </w:p>
+    <w:p>
+      <w:pPr>
+        <w:pStyle w:val="FootnoteText"/>
+      </w:pPr>
     </w:p>
   </w:footnote>
 </w:footnotes>
 </file>
 
 <file path=word/header1.xml><?xml version="1.0" encoding="utf-8"?>
-<w:hdr xmlns:wpc="http://schemas.microsoft.com/office/word/2010/wordprocessingCanvas" xmlns:cx="http://schemas.microsoft.com/office/drawing/2014/chartex" xmlns:cx1="http://schemas.microsoft.com/office/drawing/2015/9/8/chartex" xmlns:cx2="http://schemas.microsoft.com/office/drawing/2015/10/21/chartex" xmlns:cx3="http://schemas.microsoft.com/office/drawing/2016/5/9/chartex" xmlns:cx4="http://schemas.microsoft.com/office/drawing/2016/5/10/chartex" xmlns:cx5="http://schemas.microsoft.com/office/drawing/2016/5/11/chartex" xmlns:cx6="http://schemas.microsoft.com/office/drawing/2016/5/12/chartex" xmlns:cx7="http://schemas.microsoft.com/office/drawing/2016/5/13/chartex" xmlns:cx8="http://schemas.microsoft.com/office/drawing/2016/5/14/chartex" xmlns:mc="http://schemas.openxmlformats.org/markup-compatibility/2006" xmlns:aink="http://schemas.microsoft.com/office/drawing/2016/ink" xmlns:am3d="http://schemas.microsoft.com/office/drawing/2017/model3d" xmlns:o="urn:schemas-microsoft-com:office:office" xmlns:oel="http://schemas.microsoft.com/office/2019/extlst" xmlns:r="http://schemas.openxmlformats.org/officeDocument/2006/relationships" xmlns:m="http://schemas.openxmlformats.org/officeDocument/2006/math" xmlns:v="urn:schemas-microsoft-com:vml" xmlns:wp14="http://schemas.microsoft.com/office/word/2010/wordprocessingDrawing" xmlns:wp="http://schemas.openxmlformats.org/drawingml/2006/wordprocessingDrawing" xmlns:w10="urn:schemas-microsoft-com:office:word" xmlns:w="http://schemas.openxmlformats.org/wordprocessingml/2006/main" xmlns:w14="http://schemas.microsoft.com/office/word/2010/wordml" xmlns:w15="http://schemas.microsoft.com/office/word/2012/wordml" xmlns:w16cex="http://schemas.microsoft.com/office/word/2018/wordml/cex" xmlns:w16cid="http://schemas.microsoft.com/office/word/2016/wordml/cid" xmlns:w16="http://schemas.microsoft.com/office/word/2018/wordml" xmlns:w16du="http://schemas.microsoft.com/office/word/2023/wordml/word16du" xmlns:w16sdtdh="http://schemas.microsoft.com/office/word/2020/wordml/sdtdatahash" xmlns:w16se="http://schemas.microsoft.com/office/word/2015/wordml/symex" xmlns:wpg="http://schemas.microsoft.com/office/word/2010/wordprocessingGroup" xmlns:wpi="http://schemas.microsoft.com/office/word/2010/wordprocessingInk" xmlns:wne="http://schemas.microsoft.com/office/word/2006/wordml" xmlns:wps="http://schemas.microsoft.com/office/word/2010/wordprocessingShape" mc:Ignorable="w14 w15 w16se w16cid w16 w16cex w16sdtdh w16du wp14">
+<w:hdr xmlns:wpc="http://schemas.microsoft.com/office/word/2010/wordprocessingCanvas" xmlns:cx="http://schemas.microsoft.com/office/drawing/2014/chartex" xmlns:cx1="http://schemas.microsoft.com/office/drawing/2015/9/8/chartex" xmlns:cx2="http://schemas.microsoft.com/office/drawing/2015/10/21/chartex" xmlns:cx3="http://schemas.microsoft.com/office/drawing/2016/5/9/chartex" xmlns:cx4="http://schemas.microsoft.com/office/drawing/2016/5/10/chartex" xmlns:cx5="http://schemas.microsoft.com/office/drawing/2016/5/11/chartex" xmlns:cx6="http://schemas.microsoft.com/office/drawing/2016/5/12/chartex" xmlns:cx7="http://schemas.microsoft.com/office/drawing/2016/5/13/chartex" xmlns:cx8="http://schemas.microsoft.com/office/drawing/2016/5/14/chartex" xmlns:mc="http://schemas.openxmlformats.org/markup-compatibility/2006" xmlns:aink="http://schemas.microsoft.com/office/drawing/2016/ink" xmlns:am3d="http://schemas.microsoft.com/office/drawing/2017/model3d" xmlns:o="urn:schemas-microsoft-com:office:office" xmlns:oel="http://schemas.microsoft.com/office/2019/extlst" xmlns:r="http://schemas.openxmlformats.org/officeDocument/2006/relationships" xmlns:m="http://schemas.openxmlformats.org/officeDocument/2006/math" xmlns:v="urn:schemas-microsoft-com:vml" xmlns:wp14="http://schemas.microsoft.com/office/word/2010/wordprocessingDrawing" xmlns:wp="http://schemas.openxmlformats.org/drawingml/2006/wordprocessingDrawing" xmlns:w10="urn:schemas-microsoft-com:office:word" xmlns:w="http://schemas.openxmlformats.org/wordprocessingml/2006/main" xmlns:w14="http://schemas.microsoft.com/office/word/2010/wordml" xmlns:w15="http://schemas.microsoft.com/office/word/2012/wordml" xmlns:w16cex="http://schemas.microsoft.com/office/word/2018/wordml/cex" xmlns:w16cid="http://schemas.microsoft.com/office/word/2016/wordml/cid" xmlns:w16="http://schemas.microsoft.com/office/word/2018/wordml" xmlns:w16du="http://schemas.microsoft.com/office/word/2023/wordml/word16du" xmlns:w16sdtdh="http://schemas.microsoft.com/office/word/2020/wordml/sdtdatahash" xmlns:w16sdtfl="http://schemas.microsoft.com/office/word/2024/wordml/sdtformatlock" xmlns:w16se="http://schemas.microsoft.com/office/word/2015/wordml/symex" xmlns:wpg="http://schemas.microsoft.com/office/word/2010/wordprocessingGroup" xmlns:wpi="http://schemas.microsoft.com/office/word/2010/wordprocessingInk" xmlns:wne="http://schemas.microsoft.com/office/word/2006/wordml" xmlns:wps="http://schemas.microsoft.com/office/word/2010/wordprocessingShape" mc:Ignorable="w14 w15 w16se w16cid w16 w16cex w16sdtdh w16sdtfl w16du wp14">
   <w:p>
     <w:pPr>
       <w:jc w:val="right"/>
@@ -1231,7 +2122,7 @@
 </file>
 
 <file path=word/numbering.xml><?xml version="1.0" encoding="utf-8"?>
-<w:numbering xmlns:wpc="http://schemas.microsoft.com/office/word/2010/wordprocessingCanvas" xmlns:cx="http://schemas.microsoft.com/office/drawing/2014/chartex" xmlns:cx1="http://schemas.microsoft.com/office/drawing/2015/9/8/chartex" xmlns:cx2="http://schemas.microsoft.com/office/drawing/2015/10/21/chartex" xmlns:cx3="http://schemas.microsoft.com/office/drawing/2016/5/9/chartex" xmlns:cx4="http://schemas.microsoft.com/office/drawing/2016/5/10/chartex" xmlns:cx5="http://schemas.microsoft.com/office/drawing/2016/5/11/chartex" xmlns:cx6="http://schemas.microsoft.com/office/drawing/2016/5/12/chartex" xmlns:cx7="http://schemas.microsoft.com/office/drawing/2016/5/13/chartex" xmlns:cx8="http://schemas.microsoft.com/office/drawing/2016/5/14/chartex" xmlns:mc="http://schemas.openxmlformats.org/markup-compatibility/2006" xmlns:aink="http://schemas.microsoft.com/office/drawing/2016/ink" xmlns:am3d="http://schemas.microsoft.com/office/drawing/2017/model3d" xmlns:o="urn:schemas-microsoft-com:office:office" xmlns:oel="http://schemas.microsoft.com/office/2019/extlst" xmlns:r="http://schemas.openxmlformats.org/officeDocument/2006/relationships" xmlns:m="http://schemas.openxmlformats.org/officeDocument/2006/math" xmlns:v="urn:schemas-microsoft-com:vml" xmlns:wp14="http://schemas.microsoft.com/office/word/2010/wordprocessingDrawing" xmlns:wp="http://schemas.openxmlformats.org/drawingml/2006/wordprocessingDrawing" xmlns:w10="urn:schemas-microsoft-com:office:word" xmlns:w="http://schemas.openxmlformats.org/wordprocessingml/2006/main" xmlns:w14="http://schemas.microsoft.com/office/word/2010/wordml" xmlns:w15="http://schemas.microsoft.com/office/word/2012/wordml" xmlns:w16cex="http://schemas.microsoft.com/office/word/2018/wordml/cex" xmlns:w16cid="http://schemas.microsoft.com/office/word/2016/wordml/cid" xmlns:w16="http://schemas.microsoft.com/office/word/2018/wordml" xmlns:w16du="http://schemas.microsoft.com/office/word/2023/wordml/word16du" xmlns:w16sdtdh="http://schemas.microsoft.com/office/word/2020/wordml/sdtdatahash" xmlns:w16se="http://schemas.microsoft.com/office/word/2015/wordml/symex" xmlns:wpg="http://schemas.microsoft.com/office/word/2010/wordprocessingGroup" xmlns:wpi="http://schemas.microsoft.com/office/word/2010/wordprocessingInk" xmlns:wne="http://schemas.microsoft.com/office/word/2006/wordml" xmlns:wps="http://schemas.microsoft.com/office/word/2010/wordprocessingShape" mc:Ignorable="w14 w15 w16se w16cid w16 w16cex w16sdtdh w16du wp14">
+<w:numbering xmlns:wpc="http://schemas.microsoft.com/office/word/2010/wordprocessingCanvas" xmlns:cx="http://schemas.microsoft.com/office/drawing/2014/chartex" xmlns:cx1="http://schemas.microsoft.com/office/drawing/2015/9/8/chartex" xmlns:cx2="http://schemas.microsoft.com/office/drawing/2015/10/21/chartex" xmlns:cx3="http://schemas.microsoft.com/office/drawing/2016/5/9/chartex" xmlns:cx4="http://schemas.microsoft.com/office/drawing/2016/5/10/chartex" xmlns:cx5="http://schemas.microsoft.com/office/drawing/2016/5/11/chartex" xmlns:cx6="http://schemas.microsoft.com/office/drawing/2016/5/12/chartex" xmlns:cx7="http://schemas.microsoft.com/office/drawing/2016/5/13/chartex" xmlns:cx8="http://schemas.microsoft.com/office/drawing/2016/5/14/chartex" xmlns:mc="http://schemas.openxmlformats.org/markup-compatibility/2006" xmlns:aink="http://schemas.microsoft.com/office/drawing/2016/ink" xmlns:am3d="http://schemas.microsoft.com/office/drawing/2017/model3d" xmlns:o="urn:schemas-microsoft-com:office:office" xmlns:oel="http://schemas.microsoft.com/office/2019/extlst" xmlns:r="http://schemas.openxmlformats.org/officeDocument/2006/relationships" xmlns:m="http://schemas.openxmlformats.org/officeDocument/2006/math" xmlns:v="urn:schemas-microsoft-com:vml" xmlns:wp14="http://schemas.microsoft.com/office/word/2010/wordprocessingDrawing" xmlns:wp="http://schemas.openxmlformats.org/drawingml/2006/wordprocessingDrawing" xmlns:w10="urn:schemas-microsoft-com:office:word" xmlns:w="http://schemas.openxmlformats.org/wordprocessingml/2006/main" xmlns:w14="http://schemas.microsoft.com/office/word/2010/wordml" xmlns:w15="http://schemas.microsoft.com/office/word/2012/wordml" xmlns:w16cex="http://schemas.microsoft.com/office/word/2018/wordml/cex" xmlns:w16cid="http://schemas.microsoft.com/office/word/2016/wordml/cid" xmlns:w16="http://schemas.microsoft.com/office/word/2018/wordml" xmlns:w16du="http://schemas.microsoft.com/office/word/2023/wordml/word16du" xmlns:w16sdtdh="http://schemas.microsoft.com/office/word/2020/wordml/sdtdatahash" xmlns:w16sdtfl="http://schemas.microsoft.com/office/word/2024/wordml/sdtformatlock" xmlns:w16se="http://schemas.microsoft.com/office/word/2015/wordml/symex" xmlns:wpg="http://schemas.microsoft.com/office/word/2010/wordprocessingGroup" xmlns:wpi="http://schemas.microsoft.com/office/word/2010/wordprocessingInk" xmlns:wne="http://schemas.microsoft.com/office/word/2006/wordml" xmlns:wps="http://schemas.microsoft.com/office/word/2010/wordprocessingShape" mc:Ignorable="w14 w15 w16se w16cid w16 w16cex w16sdtdh w16sdtfl w16du wp14">
   <w:abstractNum w:abstractNumId="0" w15:restartNumberingAfterBreak="0">
     <w:nsid w:val="043C2982"/>
     <w:multiLevelType w:val="multilevel"/>
@@ -2567,7 +3458,7 @@
 </file>
 
 <file path=word/styles.xml><?xml version="1.0" encoding="utf-8"?>
-<w:styles xmlns:mc="http://schemas.openxmlformats.org/markup-compatibility/2006" xmlns:r="http://schemas.openxmlformats.org/officeDocument/2006/relationships" xmlns:w="http://schemas.openxmlformats.org/wordprocessingml/2006/main" xmlns:w14="http://schemas.microsoft.com/office/word/2010/wordml" xmlns:w15="http://schemas.microsoft.com/office/word/2012/wordml" xmlns:w16cex="http://schemas.microsoft.com/office/word/2018/wordml/cex" xmlns:w16cid="http://schemas.microsoft.com/office/word/2016/wordml/cid" xmlns:w16="http://schemas.microsoft.com/office/word/2018/wordml" xmlns:w16du="http://schemas.microsoft.com/office/word/2023/wordml/word16du" xmlns:w16sdtdh="http://schemas.microsoft.com/office/word/2020/wordml/sdtdatahash" xmlns:w16se="http://schemas.microsoft.com/office/word/2015/wordml/symex" mc:Ignorable="w14 w15 w16se w16cid w16 w16cex w16sdtdh w16du">
+<w:styles xmlns:mc="http://schemas.openxmlformats.org/markup-compatibility/2006" xmlns:r="http://schemas.openxmlformats.org/officeDocument/2006/relationships" xmlns:w="http://schemas.openxmlformats.org/wordprocessingml/2006/main" xmlns:w14="http://schemas.microsoft.com/office/word/2010/wordml" xmlns:w15="http://schemas.microsoft.com/office/word/2012/wordml" xmlns:w16cex="http://schemas.microsoft.com/office/word/2018/wordml/cex" xmlns:w16cid="http://schemas.microsoft.com/office/word/2016/wordml/cid" xmlns:w16="http://schemas.microsoft.com/office/word/2018/wordml" xmlns:w16du="http://schemas.microsoft.com/office/word/2023/wordml/word16du" xmlns:w16sdtdh="http://schemas.microsoft.com/office/word/2020/wordml/sdtdatahash" xmlns:w16sdtfl="http://schemas.microsoft.com/office/word/2024/wordml/sdtformatlock" xmlns:w16se="http://schemas.microsoft.com/office/word/2015/wordml/symex" mc:Ignorable="w14 w15 w16se w16cid w16 w16cex w16sdtdh w16sdtfl w16du">
   <w:docDefaults>
     <w:rPrDefault>
       <w:rPr>
@@ -3179,6 +4070,7 @@
     <w:name w:val="Title"/>
     <w:basedOn w:val="Normal"/>
     <w:next w:val="Normal"/>
+    <w:link w:val="TitleChar"/>
     <w:uiPriority w:val="10"/>
     <w:qFormat/>
     <w:pPr>
@@ -3724,10 +4616,11 @@
     <w:basedOn w:val="Normal"/>
     <w:uiPriority w:val="34"/>
     <w:qFormat/>
-    <w:rsid w:val="00DB3364"/>
+    <w:rsid w:val="00FF783C"/>
     <w:pPr>
       <w:ind w:left="720"/>
       <w:contextualSpacing/>
+      <w:jc w:val="both"/>
     </w:pPr>
   </w:style>
   <w:style w:type="character" w:styleId="Emphasis">
@@ -3774,6 +4667,7 @@
     <w:name w:val="PARA_Indent"/>
     <w:basedOn w:val="Text"/>
     <w:link w:val="PARAIndentChar"/>
+    <w:qFormat/>
     <w:rsid w:val="00621141"/>
     <w:pPr>
       <w:spacing w:line="240" w:lineRule="auto"/>
@@ -3788,6 +4682,18 @@
     <w:name w:val="PARA Char"/>
     <w:link w:val="PARA"/>
     <w:rsid w:val="00621141"/>
+  </w:style>
+  <w:style w:type="character" w:customStyle="1" w:styleId="TitleChar">
+    <w:name w:val="Title Char"/>
+    <w:basedOn w:val="DefaultParagraphFont"/>
+    <w:link w:val="Title"/>
+    <w:uiPriority w:val="10"/>
+    <w:rsid w:val="000451D3"/>
+    <w:rPr>
+      <w:kern w:val="28"/>
+      <w:sz w:val="48"/>
+      <w:szCs w:val="48"/>
+    </w:rPr>
   </w:style>
 </w:styles>
 </file>
@@ -4063,6 +4969,554 @@
 <b:Sources xmlns:b="http://schemas.openxmlformats.org/officeDocument/2006/bibliography" xmlns="http://schemas.openxmlformats.org/officeDocument/2006/bibliography" SelectedStyle="\APASixthEditionOfficeOnline.xsl" StyleName="APA" Version="6"/>
 </file>
 
+<file path=customXml/item3.xml><?xml version="1.0" encoding="utf-8"?>
+<b:Sources xmlns:b="http://schemas.openxmlformats.org/officeDocument/2006/bibliography" xmlns="http://schemas.openxmlformats.org/officeDocument/2006/bibliography" SelectedStyle="\IEEE2006OfficeOnline.xsl" StyleName="IEEE">
+  <b:Source>
+    <b:Tag>Jol15</b:Tag>
+    <b:SourceType>JournalArticle</b:SourceType>
+    <b:Author>
+      <b:Author>
+        <b:NameList>
+          <b:Person>
+            <b:Last>Jolly</b:Last>
+            <b:First>W</b:First>
+            <b:Middle>M</b:Middle>
+          </b:Person>
+        </b:NameList>
+      </b:Author>
+    </b:Author>
+    <b:Title>Climate-induced variations in global wildfire danger from 1979 to 2013</b:Title>
+    <b:Year>2015</b:Year>
+    <b:JournalName>Nature Communications</b:JournalName>
+    <b:Volume>6</b:Volume>
+    <b:RefOrder>1</b:RefOrder>
+  </b:Source>
+  <b:Source>
+    <b:Tag>Shi02</b:Tag>
+    <b:SourceType>JournalArticle</b:SourceType>
+    <b:Author>
+      <b:Author>
+        <b:NameList>
+          <b:Person>
+            <b:Last>Shim</b:Last>
+            <b:First>J</b:First>
+            <b:Middle>P</b:Middle>
+          </b:Person>
+        </b:NameList>
+      </b:Author>
+    </b:Author>
+    <b:Title>Past, present, and future of decision support technology</b:Title>
+    <b:Year>2002</b:Year>
+    <b:JournalName>Decision Support Systems</b:JournalName>
+    <b:Volume>33</b:Volume>
+    <b:Issue>2</b:Issue>
+    <b:Pages>111-126</b:Pages>
+    <b:RefOrder>2</b:RefOrder>
+  </b:Source>
+  <b:Source>
+    <b:Tag>EMDAT</b:Tag>
+    <b:SourceType>Report</b:SourceType>
+    <b:Author>
+      <b:Author>
+        <b:NameList>
+          <b:Person>
+            <b:Last>CRED</b:Last>
+          </b:Person>
+          <b:Person>
+            <b:Last>UCLouvain</b:Last>
+          </b:Person>
+        </b:NameList>
+      </b:Author>
+    </b:Author>
+    <b:Title>EM-DAT, The International Disaster Database</b:Title>
+    <b:Year>2024</b:Year>
+    <b:City>Brussels, Belgium</b:City>
+    <b:Institution>CRED, UCLouvain</b:Institution>
+    <b:RefOrder>3</b:RefOrder>
+  </b:Source>
+  <b:Source>
+    <b:Tag>Noo11</b:Tag>
+    <b:SourceType>JournalArticle</b:SourceType>
+    <b:Author>
+      <b:Author>
+        <b:NameList>
+          <b:Person>
+            <b:Last>Noonan-Wright</b:Last>
+            <b:First>E</b:First>
+            <b:Middle>K</b:Middle>
+          </b:Person>
+        </b:NameList>
+      </b:Author>
+    </b:Author>
+    <b:Title>Developing the U.S. Wildland Fire Decision Support System</b:Title>
+    <b:Year>2011</b:Year>
+    <b:JournalName>Journal of Combustion</b:JournalName>
+    <b:Volume>2011</b:Volume>
+    <b:RefOrder>4</b:RefOrder>
+  </b:Source>
+  <b:Source>
+    <b:Tag>Fin06</b:Tag>
+    <b:SourceType>ConferenceProceedings</b:SourceType>
+    <b:Author>
+      <b:Author>
+        <b:NameList>
+          <b:Person>
+            <b:Last>Finney</b:Last>
+            <b:First>M</b:First>
+            <b:Middle>A</b:Middle>
+          </b:Person>
+        </b:NameList>
+      </b:Author>
+    </b:Author>
+    <b:Title>An overview of FlamMap fire modeling capabilities</b:Title>
+    <b:Year>2006</b:Year>
+    <b:ConferenceName>Fuels Management - How to Measure Success, USDA Forest Service Proc. RMRS-P-41</b:ConferenceName>
+    <b:Pages>213-220</b:Pages>
+    <b:RefOrder>5</b:RefOrder>
+  </b:Source>
+  <b:Source>
+    <b:Tag>Rot72</b:Tag>
+    <b:SourceType>Report</b:SourceType>
+    <b:Author>
+      <b:Author>
+        <b:NameList>
+          <b:Person>
+            <b:Last>Rothermel</b:Last>
+            <b:First>R</b:First>
+            <b:Middle>C</b:Middle>
+          </b:Person>
+        </b:NameList>
+      </b:Author>
+    </b:Author>
+    <b:Title>A mathematical model for predicting fire spread in wildland fuels</b:Title>
+    <b:Year>1972</b:Year>
+    <b:Institution>USDA Forest Service</b:Institution>
+    <b:Department>Res. Paper INT-115</b:Department>
+    <b:RefOrder>6</b:RefOrder>
+  </b:Source>
+  <b:Source>
+    <b:Tag>Zho19</b:Tag>
+    <b:SourceType>JournalArticle</b:SourceType>
+    <b:Author>
+      <b:Author>
+        <b:NameList>
+          <b:Person>
+            <b:Last>Zhou</b:Last>
+            <b:First>S</b:First>
+          </b:Person>
+          <b:Person>
+            <b:Last>Erdogan</b:Last>
+            <b:First>A</b:First>
+          </b:Person>
+        </b:NameList>
+      </b:Author>
+    </b:Author>
+    <b:Title>A spatial optimization model for resource allocation for wildfire suppression and resident evacuation</b:Title>
+    <b:Year>2019</b:Year>
+    <b:JournalName>Computers &amp; Industrial Engineering</b:JournalName>
+    <b:Volume>138</b:Volume>
+    <b:RefOrder>7</b:RefOrder>
+  </b:Source>
+  <b:Source>
+    <b:Tag>Tri00</b:Tag>
+    <b:SourceType>Book</b:SourceType>
+    <b:Author>
+      <b:Author>
+        <b:NameList>
+          <b:Person>
+            <b:Last>Triantaphyllou</b:Last>
+            <b:First>E</b:First>
+          </b:Person>
+        </b:NameList>
+      </b:Author>
+    </b:Author>
+    <b:Title>Multi-Criteria Decision Making Methods: A Comparative Study</b:Title>
+    <b:Year>2000</b:Year>
+    <b:Publisher>Kluwer</b:Publisher>
+    <b:City>Dordrecht</b:City>
+    <b:RefOrder>8</b:RefOrder>
+  </b:Source>
+  <b:Source>
+    <b:Tag>Huo22</b:Tag>
+    <b:SourceType>JournalArticle</b:SourceType>
+    <b:Author>
+      <b:Author>
+        <b:NameList>
+          <b:Person>
+            <b:Last>Huot</b:Last>
+            <b:First>F</b:First>
+          </b:Person>
+        </b:NameList>
+      </b:Author>
+    </b:Author>
+    <b:Title>Next day wildfire spread: A machine learning dataset to predict wildfire spreading from remote-sensing data</b:Title>
+    <b:Year>2022</b:Year>
+    <b:JournalName>IEEE Transactions on Geoscience and Remote Sensing</b:JournalName>
+    <b:Volume>60</b:Volume>
+    <b:Pages>1-13</b:Pages>
+    <b:RefOrder>9</b:RefOrder>
+  </b:Source>
+  <b:Source>
+    <b:Tag>Dub25</b:Tag>
+    <b:SourceType>JournalArticle</b:SourceType>
+    <b:Author>
+      <b:Author>
+        <b:NameList>
+          <b:Person>
+            <b:Last>Dubey</b:Last>
+            <b:First>P</b:First>
+          </b:Person>
+          <b:Person>
+            <b:Last>Dubey</b:Last>
+            <b:First>P</b:First>
+          </b:Person>
+        </b:NameList>
+      </b:Author>
+    </b:Author>
+    <b:Title>Bridging spatiotemporal wildfire prediction and decision modeling using transformer networks and fuzzy inference systems</b:Title>
+    <b:Year>2025</b:Year>
+    <b:JournalName>MethodsX</b:JournalName>
+    <b:Volume>15</b:Volume>
+    <b:RefOrder>10</b:RefOrder>
+  </b:Source>
+  <b:Source>
+    <b:Tag>Orp25</b:Tag>
+    <b:SourceType>JournalArticle</b:SourceType>
+    <b:Author>
+      <b:Author>
+        <b:NameList>
+          <b:Person>
+            <b:Last>Orphanoudakis</b:Last>
+            <b:First>T</b:First>
+          </b:Person>
+          <b:Person>
+            <b:Last>Betzelos</b:Last>
+            <b:First>C</b:First>
+          </b:Person>
+          <b:Person>
+            <b:Last>Leligou</b:Last>
+            <b:First>H</b:First>
+            <b:Middle>C</b:Middle>
+          </b:Person>
+        </b:NameList>
+      </b:Author>
+    </b:Author>
+    <b:Title>MORA: A multicriteria optimal resource allocation and decision support toolkit for wildfire management</b:Title>
+    <b:Year>2025</b:Year>
+    <b:JournalName>Algorithms</b:JournalName>
+    <b:Volume>18</b:Volume>
+    <b:Issue>11</b:Issue>
+    <b:RefOrder>11</b:RefOrder>
+  </b:Source>
+  <b:Source>
+    <b:Tag>Lou21</b:Tag>
+    <b:SourceType>JournalArticle</b:SourceType>
+    <b:Author>
+      <b:Author>
+        <b:NameList>
+          <b:Person>
+            <b:Last>Lourenco</b:Last>
+            <b:First>M</b:First>
+          </b:Person>
+          <b:Person>
+            <b:Last>Oliveira</b:Last>
+            <b:First>L</b:First>
+            <b:Middle>B</b:Middle>
+          </b:Person>
+          <b:Person>
+            <b:Last>Mora</b:Last>
+            <b:First>A</b:First>
+          </b:Person>
+        </b:NameList>
+      </b:Author>
+    </b:Author>
+    <b:Title>An integrated decision support system for improving wildfire suppression management</b:Title>
+    <b:Year>2021</b:Year>
+    <b:JournalName>ISPRS International Journal of Geo-Information</b:JournalName>
+    <b:Volume>10</b:Volume>
+    <b:Issue>8</b:Issue>
+    <b:RefOrder>12</b:RefOrder>
+  </b:Source>
+  <b:Source>
+    <b:Tag>Tho11</b:Tag>
+    <b:SourceType>JournalArticle</b:SourceType>
+    <b:Author>
+      <b:Author>
+        <b:NameList>
+          <b:Person>
+            <b:Last>Thompson</b:Last>
+            <b:First>M</b:First>
+            <b:Middle>P</b:Middle>
+          </b:Person>
+          <b:Person>
+            <b:Last>Calkin</b:Last>
+            <b:First>D</b:First>
+            <b:Middle>E</b:Middle>
+          </b:Person>
+        </b:NameList>
+      </b:Author>
+    </b:Author>
+    <b:Title>Uncertainty and risk in wildland fire management: A review</b:Title>
+    <b:Year>2011</b:Year>
+    <b:JournalName>Journal of Environmental Management</b:JournalName>
+    <b:Volume>92</b:Volume>
+    <b:Issue>8</b:Issue>
+    <b:Pages>1895-1909</b:Pages>
+    <b:RefOrder>13</b:RefOrder>
+  </b:Source>
+  <b:Source>
+    <b:Tag>Lun17</b:Tag>
+    <b:SourceType>ConferenceProceedings</b:SourceType>
+    <b:Author>
+      <b:Author>
+        <b:NameList>
+          <b:Person>
+            <b:Last>Lundberg</b:Last>
+            <b:First>S</b:First>
+            <b:Middle>M</b:Middle>
+          </b:Person>
+          <b:Person>
+            <b:Last>Lee</b:Last>
+            <b:First>S</b:First>
+            <b:Middle>I</b:Middle>
+          </b:Person>
+        </b:NameList>
+      </b:Author>
+    </b:Author>
+    <b:Title>A unified approach to interpreting model predictions</b:Title>
+    <b:Year>2017</b:Year>
+    <b:ConferenceName>Advances in Neural Information Processing Systems (NeurIPS)</b:ConferenceName>
+    <b:Pages>4765-4774</b:Pages>
+    <b:RefOrder>14</b:RefOrder>
+  </b:Source>
+  <b:Source>
+    <b:Tag>Rib16</b:Tag>
+    <b:SourceType>ConferenceProceedings</b:SourceType>
+    <b:Author>
+      <b:Author>
+        <b:NameList>
+          <b:Person>
+            <b:Last>Ribeiro</b:Last>
+            <b:First>M</b:First>
+            <b:Middle>T</b:Middle>
+          </b:Person>
+          <b:Person>
+            <b:Last>Singh</b:Last>
+            <b:First>S</b:First>
+          </b:Person>
+          <b:Person>
+            <b:Last>Guestrin</b:Last>
+            <b:First>C</b:First>
+          </b:Person>
+        </b:NameList>
+      </b:Author>
+    </b:Author>
+    <b:Title>Why should I trust you?: Explaining the predictions of any classifier</b:Title>
+    <b:Year>2016</b:Year>
+    <b:ConferenceName>Proc. ACM SIGKDD</b:ConferenceName>
+    <b:Pages>1135-1144</b:Pages>
+    <b:RefOrder>15</b:RefOrder>
+  </b:Source>
+  <b:Source>
+    <b:Tag>Kae98</b:Tag>
+    <b:SourceType>JournalArticle</b:SourceType>
+    <b:Author>
+      <b:Author>
+        <b:NameList>
+          <b:Person>
+            <b:Last>Kaelbling</b:Last>
+            <b:First>L</b:First>
+            <b:Middle>P</b:Middle>
+          </b:Person>
+          <b:Person>
+            <b:Last>Littman</b:Last>
+            <b:First>M</b:First>
+            <b:Middle>L</b:Middle>
+          </b:Person>
+          <b:Person>
+            <b:Last>Cassandra</b:Last>
+            <b:First>A</b:First>
+            <b:Middle>R</b:Middle>
+          </b:Person>
+        </b:NameList>
+      </b:Author>
+    </b:Author>
+    <b:Title>Planning and acting in partially observable stochastic domains</b:Title>
+    <b:Year>1998</b:Year>
+    <b:JournalName>Artificial Intelligence</b:JournalName>
+    <b:Volume>101</b:Volume>
+    <b:Pages>99-134</b:Pages>
+    <b:RefOrder>16</b:RefOrder>
+  </b:Source>
+  <b:Source>
+    <b:Tag>Sha76</b:Tag>
+    <b:SourceType>Book</b:SourceType>
+    <b:Author>
+      <b:Author>
+        <b:NameList>
+          <b:Person>
+            <b:Last>Shafer</b:Last>
+            <b:First>G</b:First>
+          </b:Person>
+        </b:NameList>
+      </b:Author>
+    </b:Author>
+    <b:Title>A Mathematical Theory of Evidence</b:Title>
+    <b:Year>1976</b:Year>
+    <b:Publisher>Princeton University Press</b:Publisher>
+    <b:City>Princeton, NJ</b:City>
+    <b:RefOrder>17</b:RefOrder>
+  </b:Source>
+  <b:Source>
+    <b:Tag>Zad65</b:Tag>
+    <b:SourceType>JournalArticle</b:SourceType>
+    <b:Author>
+      <b:Author>
+        <b:NameList>
+          <b:Person>
+            <b:Last>Zadeh</b:Last>
+            <b:First>L</b:First>
+            <b:Middle>A</b:Middle>
+          </b:Person>
+        </b:NameList>
+      </b:Author>
+    </b:Author>
+    <b:Title>Fuzzy sets</b:Title>
+    <b:Year>1965</b:Year>
+    <b:JournalName>Information and Control</b:JournalName>
+    <b:Volume>8</b:Volume>
+    <b:Issue>3</b:Issue>
+    <b:Pages>338-353</b:Pages>
+    <b:RefOrder>18</b:RefOrder>
+  </b:Source>
+  <b:Source>
+    <b:Tag>Mam75</b:Tag>
+    <b:SourceType>JournalArticle</b:SourceType>
+    <b:Author>
+      <b:Author>
+        <b:NameList>
+          <b:Person>
+            <b:Last>Mamdani</b:Last>
+            <b:First>E</b:First>
+            <b:Middle>H</b:Middle>
+          </b:Person>
+          <b:Person>
+            <b:Last>Assilian</b:Last>
+            <b:First>S</b:First>
+          </b:Person>
+        </b:NameList>
+      </b:Author>
+    </b:Author>
+    <b:Title>An experiment in linguistic synthesis with a fuzzy logic controller</b:Title>
+    <b:Year>1975</b:Year>
+    <b:JournalName>International Journal of Man-Machine Studies</b:JournalName>
+    <b:Volume>7</b:Volume>
+    <b:Issue>1</b:Issue>
+    <b:Pages>1-13</b:Pages>
+    <b:RefOrder>19</b:RefOrder>
+  </b:Source>
+  <b:Source>
+    <b:Tag>Tsa09</b:Tag>
+    <b:SourceType>ConferenceProceedings</b:SourceType>
+    <b:Author>
+      <b:Author>
+        <b:NameList>
+          <b:Person>
+            <b:Last>Tsataltzinos</b:Last>
+            <b:First>T</b:First>
+          </b:Person>
+          <b:Person>
+            <b:Last>Iliadis</b:Last>
+            <b:First>L</b:First>
+          </b:Person>
+          <b:Person>
+            <b:Last>Spartalis</b:Last>
+            <b:First>S</b:First>
+          </b:Person>
+        </b:NameList>
+      </b:Author>
+    </b:Author>
+    <b:Title>An intelligent fuzzy inference system for risk estimation: The case of forest fires in Greece</b:Title>
+    <b:Year>2009</b:Year>
+    <b:ConferenceName>IFIP AIAI</b:ConferenceName>
+    <b:Pages>303-310</b:Pages>
+    <b:RefOrder>20</b:RefOrder>
+  </b:Source>
+  <b:Source>
+    <b:Tag>Woo09</b:Tag>
+    <b:SourceType>Book</b:SourceType>
+    <b:Author>
+      <b:Author>
+        <b:NameList>
+          <b:Person>
+            <b:Last>Wooldridge</b:Last>
+            <b:First>M</b:First>
+          </b:Person>
+        </b:NameList>
+      </b:Author>
+    </b:Author>
+    <b:Title>An Introduction to MultiAgent Systems</b:Title>
+    <b:Year>2009</b:Year>
+    <b:Publisher>Wiley</b:Publisher>
+    <b:City>Chichester, U.K.</b:City>
+    <b:RefOrder>21</b:RefOrder>
+  </b:Source>
+  <b:Source>
+    <b:Tag>Raj91</b:Tag>
+    <b:SourceType>JournalArticle</b:SourceType>
+    <b:Author>
+      <b:Author>
+        <b:NameList>
+          <b:Person>
+            <b:Last>Raju</b:Last>
+            <b:First>G</b:First>
+            <b:Middle>V</b:Middle>
+          </b:Person>
+          <b:Person>
+            <b:Last>Zhou</b:Last>
+            <b:First>J</b:First>
+          </b:Person>
+          <b:Person>
+            <b:Last>Kisner</b:Last>
+            <b:First>R</b:First>
+            <b:Middle>A</b:Middle>
+          </b:Person>
+        </b:NameList>
+      </b:Author>
+    </b:Author>
+    <b:Title>Hierarchical fuzzy control</b:Title>
+    <b:Year>1991</b:Year>
+    <b:JournalName>International Journal of Control</b:JournalName>
+    <b:Volume>54</b:Volume>
+    <b:Issue>5</b:Issue>
+    <b:Pages>1201-1216</b:Pages>
+    <b:RefOrder>22</b:RefOrder>
+  </b:Source>
+  <b:Source>
+    <b:Tag>Sim56</b:Tag>
+    <b:SourceType>JournalArticle</b:SourceType>
+    <b:Author>
+      <b:Author>
+        <b:NameList>
+          <b:Person>
+            <b:Last>Simon</b:Last>
+            <b:First>H</b:First>
+            <b:Middle>A</b:Middle>
+          </b:Person>
+        </b:NameList>
+      </b:Author>
+    </b:Author>
+    <b:Title>Rational choice and the structure of the environment</b:Title>
+    <b:Year>1956</b:Year>
+    <b:JournalName>Psychological Review</b:JournalName>
+    <b:Volume>63</b:Volume>
+    <b:Issue>2</b:Issue>
+    <b:Pages>129-138</b:Pages>
+    <b:RefOrder>23</b:RefOrder>
+  </b:Source>
+</b:Sources>
+</file>
+
 <file path=customXml/itemProps1.xml><?xml version="1.0" encoding="utf-8"?>
 <ds:datastoreItem xmlns:ds="http://schemas.openxmlformats.org/officeDocument/2006/customXml" ds:itemID="{11111111-1234-1234-1234-123412341234}">
   <ds:schemaRefs>
@@ -4078,4 +5532,12 @@
     <ds:schemaRef ds:uri="http://schemas.openxmlformats.org/officeDocument/2006/bibliography"/>
   </ds:schemaRefs>
 </ds:datastoreItem>
+</file>
+
+<file path=customXml/itemProps3.xml><?xml version="1.0" encoding="utf-8"?>
+<ds:datastoreItem xmlns:ds="http://schemas.openxmlformats.org/officeDocument/2006/customXml" ds:itemID="{1DF73B11-FF0A-4BCE-930E-B7146A4D2109}">
+  <ds:schemaRefs>
+    <ds:schemaRef ds:uri="http://schemas.openxmlformats.org/officeDocument/2006/bibliography"/>
+  </ds:schemaRefs>
+</ds:datastoreItem>
 </file>
</xml_diff>